<commit_message>
Questionnaire: add Vision 2030/NDAP alignment and GISP questions
Adds a Strategic Alignment section (national priorities and NDAP
365-day pathway), a new question area on digital-government alignment,
and GISP questions for domains, email, hosting and security monitoring.

Co-Authored-By: Claude Opus 5.5 <noreply@anthropic.com>
Claude-Session: https://claude.ai/code/session_01X474181YGTsF16kamYY3c3
</commit_message>
<xml_diff>
--- a/docs/ZIDA-Pre-Implementation-Discovery-Questionnaire.docx
+++ b/docs/ZIDA-Pre-Implementation-Discovery-Questionnaire.docx
@@ -629,6 +629,1285 @@
           <w:sz w:val="28"/>
           <w:szCs w:val="28"/>
         </w:rPr>
+        <w:t xml:space="preserve">Strategic Alignment</w:t>
+      </w:r>
+    </w:p>
+    <w:p>
+      <w:pPr>
+        <w:spacing w:after="120" w:line="276"/>
+      </w:pPr>
+      <w:r>
+        <w:rPr>
+          <w:rFonts w:ascii="Calibri" w:cs="Calibri" w:eastAsia="Calibri" w:hAnsi="Calibri"/>
+          <w:sz w:val="21"/>
+          <w:szCs w:val="21"/>
+        </w:rPr>
+        <w:t xml:space="preserve">ZidaProject is the first visible layer of Afronovation’s National Digital Acceleration Program (NDAP): a structured pathway that helps Government move from digital ambition to governed, measurable execution. This questionnaire is the first step of NDAP implementation, aligning the platform with national priorities before production begins.</w:t>
+      </w:r>
+    </w:p>
+    <w:tbl>
+      <w:tblPr>
+        <w:tblW w:type="dxa" w:w="9638"/>
+        <w:tblBorders>
+          <w:top w:val="single" w:color="auto" w:sz="4"/>
+          <w:left w:val="single" w:color="auto" w:sz="4"/>
+          <w:bottom w:val="single" w:color="auto" w:sz="4"/>
+          <w:right w:val="single" w:color="auto" w:sz="4"/>
+          <w:insideH w:val="single" w:color="auto" w:sz="4"/>
+          <w:insideV w:val="single" w:color="auto" w:sz="4"/>
+        </w:tblBorders>
+        <w:tblLayout w:type="fixed"/>
+      </w:tblPr>
+      <w:tblGrid>
+        <w:gridCol w:w="2600"/>
+        <w:gridCol w:w="3719"/>
+        <w:gridCol w:w="3319"/>
+      </w:tblGrid>
+      <w:tr>
+        <w:trPr>
+          <w:tblHeader/>
+        </w:trPr>
+        <w:tc>
+          <w:tcPr>
+            <w:tcW w:type="dxa" w:w="2600"/>
+            <w:tcBorders>
+              <w:top w:val="single" w:color="C9D3CD" w:sz="4"/>
+              <w:left w:val="single" w:color="C9D3CD" w:sz="4"/>
+              <w:bottom w:val="single" w:color="C9D3CD" w:sz="4"/>
+              <w:right w:val="single" w:color="C9D3CD" w:sz="4"/>
+            </w:tcBorders>
+            <w:shd w:fill="14532D" w:color="auto" w:val="clear"/>
+            <w:tcMar>
+              <w:top w:type="dxa" w:w="80"/>
+              <w:left w:type="dxa" w:w="110"/>
+              <w:bottom w:type="dxa" w:w="80"/>
+              <w:right w:type="dxa" w:w="110"/>
+            </w:tcMar>
+          </w:tcPr>
+          <w:p>
+            <w:pPr>
+              <w:spacing w:after="0"/>
+            </w:pPr>
+            <w:r>
+              <w:rPr>
+                <w:rFonts w:ascii="Calibri" w:cs="Calibri" w:eastAsia="Calibri" w:hAnsi="Calibri"/>
+                <w:b/>
+                <w:bCs/>
+                <w:color w:val="FFFFFF"/>
+                <w:sz w:val="19"/>
+                <w:szCs w:val="19"/>
+              </w:rPr>
+              <w:t xml:space="preserve">National priority</w:t>
+            </w:r>
+          </w:p>
+        </w:tc>
+        <w:tc>
+          <w:tcPr>
+            <w:tcW w:type="dxa" w:w="3719"/>
+            <w:tcBorders>
+              <w:top w:val="single" w:color="C9D3CD" w:sz="4"/>
+              <w:left w:val="single" w:color="C9D3CD" w:sz="4"/>
+              <w:bottom w:val="single" w:color="C9D3CD" w:sz="4"/>
+              <w:right w:val="single" w:color="C9D3CD" w:sz="4"/>
+            </w:tcBorders>
+            <w:shd w:fill="14532D" w:color="auto" w:val="clear"/>
+            <w:tcMar>
+              <w:top w:type="dxa" w:w="80"/>
+              <w:left w:type="dxa" w:w="110"/>
+              <w:bottom w:type="dxa" w:w="80"/>
+              <w:right w:type="dxa" w:w="110"/>
+            </w:tcMar>
+          </w:tcPr>
+          <w:p>
+            <w:pPr>
+              <w:spacing w:after="0"/>
+            </w:pPr>
+            <w:r>
+              <w:rPr>
+                <w:rFonts w:ascii="Calibri" w:cs="Calibri" w:eastAsia="Calibri" w:hAnsi="Calibri"/>
+                <w:b/>
+                <w:bCs/>
+                <w:color w:val="FFFFFF"/>
+                <w:sz w:val="19"/>
+                <w:szCs w:val="19"/>
+              </w:rPr>
+              <w:t xml:space="preserve">What it requires</w:t>
+            </w:r>
+          </w:p>
+        </w:tc>
+        <w:tc>
+          <w:tcPr>
+            <w:tcW w:type="dxa" w:w="3319"/>
+            <w:tcBorders>
+              <w:top w:val="single" w:color="C9D3CD" w:sz="4"/>
+              <w:left w:val="single" w:color="C9D3CD" w:sz="4"/>
+              <w:bottom w:val="single" w:color="C9D3CD" w:sz="4"/>
+              <w:right w:val="single" w:color="C9D3CD" w:sz="4"/>
+            </w:tcBorders>
+            <w:shd w:fill="14532D" w:color="auto" w:val="clear"/>
+            <w:tcMar>
+              <w:top w:type="dxa" w:w="80"/>
+              <w:left w:type="dxa" w:w="110"/>
+              <w:bottom w:type="dxa" w:w="80"/>
+              <w:right w:type="dxa" w:w="110"/>
+            </w:tcMar>
+          </w:tcPr>
+          <w:p>
+            <w:pPr>
+              <w:spacing w:after="0"/>
+            </w:pPr>
+            <w:r>
+              <w:rPr>
+                <w:rFonts w:ascii="Calibri" w:cs="Calibri" w:eastAsia="Calibri" w:hAnsi="Calibri"/>
+                <w:b/>
+                <w:bCs/>
+                <w:color w:val="FFFFFF"/>
+                <w:sz w:val="19"/>
+                <w:szCs w:val="19"/>
+              </w:rPr>
+              <w:t xml:space="preserve">How ZidaProject contributes</w:t>
+            </w:r>
+          </w:p>
+        </w:tc>
+      </w:tr>
+      <w:tr>
+        <w:trPr>
+          <w:cantSplit/>
+        </w:trPr>
+        <w:tc>
+          <w:tcPr>
+            <w:tcW w:type="dxa" w:w="2600"/>
+            <w:tcBorders>
+              <w:top w:val="single" w:color="C9D3CD" w:sz="4"/>
+              <w:left w:val="single" w:color="C9D3CD" w:sz="4"/>
+              <w:bottom w:val="single" w:color="C9D3CD" w:sz="4"/>
+              <w:right w:val="single" w:color="C9D3CD" w:sz="4"/>
+            </w:tcBorders>
+            <w:shd w:fill="FAFBFA" w:color="auto" w:val="clear"/>
+            <w:tcMar>
+              <w:top w:type="dxa" w:w="80"/>
+              <w:left w:type="dxa" w:w="110"/>
+              <w:bottom w:type="dxa" w:w="80"/>
+              <w:right w:type="dxa" w:w="110"/>
+            </w:tcMar>
+          </w:tcPr>
+          <w:p>
+            <w:pPr>
+              <w:spacing w:after="0"/>
+            </w:pPr>
+            <w:r>
+              <w:rPr>
+                <w:rFonts w:ascii="Calibri" w:cs="Calibri" w:eastAsia="Calibri" w:hAnsi="Calibri"/>
+                <w:sz w:val="20"/>
+                <w:szCs w:val="20"/>
+              </w:rPr>
+              <w:t xml:space="preserve">Vision 2030</w:t>
+            </w:r>
+          </w:p>
+        </w:tc>
+        <w:tc>
+          <w:tcPr>
+            <w:tcW w:type="dxa" w:w="3719"/>
+            <w:tcBorders>
+              <w:top w:val="single" w:color="C9D3CD" w:sz="4"/>
+              <w:left w:val="single" w:color="C9D3CD" w:sz="4"/>
+              <w:bottom w:val="single" w:color="C9D3CD" w:sz="4"/>
+              <w:right w:val="single" w:color="C9D3CD" w:sz="4"/>
+            </w:tcBorders>
+            <w:shd w:fill="FAFBFA" w:color="auto" w:val="clear"/>
+            <w:tcMar>
+              <w:top w:type="dxa" w:w="80"/>
+              <w:left w:type="dxa" w:w="110"/>
+              <w:bottom w:type="dxa" w:w="80"/>
+              <w:right w:type="dxa" w:w="110"/>
+            </w:tcMar>
+          </w:tcPr>
+          <w:p>
+            <w:pPr>
+              <w:spacing w:after="0"/>
+            </w:pPr>
+            <w:r>
+              <w:rPr>
+                <w:rFonts w:ascii="Calibri" w:cs="Calibri" w:eastAsia="Calibri" w:hAnsi="Calibri"/>
+                <w:sz w:val="20"/>
+                <w:szCs w:val="20"/>
+              </w:rPr>
+              <w:t xml:space="preserve">Sustained investment into productive sectors toward upper-middle-income status</w:t>
+            </w:r>
+          </w:p>
+        </w:tc>
+        <w:tc>
+          <w:tcPr>
+            <w:tcW w:type="dxa" w:w="3319"/>
+            <w:tcBorders>
+              <w:top w:val="single" w:color="C9D3CD" w:sz="4"/>
+              <w:left w:val="single" w:color="C9D3CD" w:sz="4"/>
+              <w:bottom w:val="single" w:color="C9D3CD" w:sz="4"/>
+              <w:right w:val="single" w:color="C9D3CD" w:sz="4"/>
+            </w:tcBorders>
+            <w:shd w:fill="FAFBFA" w:color="auto" w:val="clear"/>
+            <w:tcMar>
+              <w:top w:type="dxa" w:w="80"/>
+              <w:left w:type="dxa" w:w="110"/>
+              <w:bottom w:type="dxa" w:w="80"/>
+              <w:right w:type="dxa" w:w="110"/>
+            </w:tcMar>
+          </w:tcPr>
+          <w:p>
+            <w:pPr>
+              <w:spacing w:after="0"/>
+            </w:pPr>
+            <w:r>
+              <w:rPr>
+                <w:rFonts w:ascii="Calibri" w:cs="Calibri" w:eastAsia="Calibri" w:hAnsi="Calibri"/>
+                <w:sz w:val="20"/>
+                <w:szCs w:val="20"/>
+              </w:rPr>
+              <w:t xml:space="preserve">A credible, current, investor-facing view of the national project pipeline</w:t>
+            </w:r>
+          </w:p>
+        </w:tc>
+      </w:tr>
+      <w:tr>
+        <w:trPr>
+          <w:cantSplit/>
+        </w:trPr>
+        <w:tc>
+          <w:tcPr>
+            <w:tcW w:type="dxa" w:w="2600"/>
+            <w:tcBorders>
+              <w:top w:val="single" w:color="C9D3CD" w:sz="4"/>
+              <w:left w:val="single" w:color="C9D3CD" w:sz="4"/>
+              <w:bottom w:val="single" w:color="C9D3CD" w:sz="4"/>
+              <w:right w:val="single" w:color="C9D3CD" w:sz="4"/>
+            </w:tcBorders>
+            <w:shd w:fill="FFFFFF" w:color="auto" w:val="clear"/>
+            <w:tcMar>
+              <w:top w:type="dxa" w:w="80"/>
+              <w:left w:type="dxa" w:w="110"/>
+              <w:bottom w:type="dxa" w:w="80"/>
+              <w:right w:type="dxa" w:w="110"/>
+            </w:tcMar>
+          </w:tcPr>
+          <w:p>
+            <w:pPr>
+              <w:spacing w:after="0"/>
+            </w:pPr>
+            <w:r>
+              <w:rPr>
+                <w:rFonts w:ascii="Calibri" w:cs="Calibri" w:eastAsia="Calibri" w:hAnsi="Calibri"/>
+                <w:sz w:val="20"/>
+                <w:szCs w:val="20"/>
+              </w:rPr>
+              <w:t xml:space="preserve">National Development Strategy 2 (2026–2030)</w:t>
+            </w:r>
+          </w:p>
+        </w:tc>
+        <w:tc>
+          <w:tcPr>
+            <w:tcW w:type="dxa" w:w="3719"/>
+            <w:tcBorders>
+              <w:top w:val="single" w:color="C9D3CD" w:sz="4"/>
+              <w:left w:val="single" w:color="C9D3CD" w:sz="4"/>
+              <w:bottom w:val="single" w:color="C9D3CD" w:sz="4"/>
+              <w:right w:val="single" w:color="C9D3CD" w:sz="4"/>
+            </w:tcBorders>
+            <w:shd w:fill="FFFFFF" w:color="auto" w:val="clear"/>
+            <w:tcMar>
+              <w:top w:type="dxa" w:w="80"/>
+              <w:left w:type="dxa" w:w="110"/>
+              <w:bottom w:type="dxa" w:w="80"/>
+              <w:right w:type="dxa" w:w="110"/>
+            </w:tcMar>
+          </w:tcPr>
+          <w:p>
+            <w:pPr>
+              <w:spacing w:after="0"/>
+            </w:pPr>
+            <w:r>
+              <w:rPr>
+                <w:rFonts w:ascii="Calibri" w:cs="Calibri" w:eastAsia="Calibri" w:hAnsi="Calibri"/>
+                <w:sz w:val="20"/>
+                <w:szCs w:val="20"/>
+              </w:rPr>
+              <w:t xml:space="preserve">Coordinated delivery across ministries against measurable priorities</w:t>
+            </w:r>
+          </w:p>
+        </w:tc>
+        <w:tc>
+          <w:tcPr>
+            <w:tcW w:type="dxa" w:w="3319"/>
+            <w:tcBorders>
+              <w:top w:val="single" w:color="C9D3CD" w:sz="4"/>
+              <w:left w:val="single" w:color="C9D3CD" w:sz="4"/>
+              <w:bottom w:val="single" w:color="C9D3CD" w:sz="4"/>
+              <w:right w:val="single" w:color="C9D3CD" w:sz="4"/>
+            </w:tcBorders>
+            <w:shd w:fill="FFFFFF" w:color="auto" w:val="clear"/>
+            <w:tcMar>
+              <w:top w:type="dxa" w:w="80"/>
+              <w:left w:type="dxa" w:w="110"/>
+              <w:bottom w:type="dxa" w:w="80"/>
+              <w:right w:type="dxa" w:w="110"/>
+            </w:tcMar>
+          </w:tcPr>
+          <w:p>
+            <w:pPr>
+              <w:spacing w:after="0"/>
+            </w:pPr>
+            <w:r>
+              <w:rPr>
+                <w:rFonts w:ascii="Calibri" w:cs="Calibri" w:eastAsia="Calibri" w:hAnsi="Calibri"/>
+                <w:sz w:val="20"/>
+                <w:szCs w:val="20"/>
+              </w:rPr>
+              <w:t xml:space="preserve">Every project classified against a strategic pillar and a beneficiary ministry, visible as data</w:t>
+            </w:r>
+          </w:p>
+        </w:tc>
+      </w:tr>
+      <w:tr>
+        <w:trPr>
+          <w:cantSplit/>
+        </w:trPr>
+        <w:tc>
+          <w:tcPr>
+            <w:tcW w:type="dxa" w:w="2600"/>
+            <w:tcBorders>
+              <w:top w:val="single" w:color="C9D3CD" w:sz="4"/>
+              <w:left w:val="single" w:color="C9D3CD" w:sz="4"/>
+              <w:bottom w:val="single" w:color="C9D3CD" w:sz="4"/>
+              <w:right w:val="single" w:color="C9D3CD" w:sz="4"/>
+            </w:tcBorders>
+            <w:shd w:fill="FAFBFA" w:color="auto" w:val="clear"/>
+            <w:tcMar>
+              <w:top w:type="dxa" w:w="80"/>
+              <w:left w:type="dxa" w:w="110"/>
+              <w:bottom w:type="dxa" w:w="80"/>
+              <w:right w:type="dxa" w:w="110"/>
+            </w:tcMar>
+          </w:tcPr>
+          <w:p>
+            <w:pPr>
+              <w:spacing w:after="0"/>
+            </w:pPr>
+            <w:r>
+              <w:rPr>
+                <w:rFonts w:ascii="Calibri" w:cs="Calibri" w:eastAsia="Calibri" w:hAnsi="Calibri"/>
+                <w:sz w:val="20"/>
+                <w:szCs w:val="20"/>
+              </w:rPr>
+              <w:t xml:space="preserve">Smart Zimbabwe 2030</w:t>
+            </w:r>
+          </w:p>
+        </w:tc>
+        <w:tc>
+          <w:tcPr>
+            <w:tcW w:type="dxa" w:w="3719"/>
+            <w:tcBorders>
+              <w:top w:val="single" w:color="C9D3CD" w:sz="4"/>
+              <w:left w:val="single" w:color="C9D3CD" w:sz="4"/>
+              <w:bottom w:val="single" w:color="C9D3CD" w:sz="4"/>
+              <w:right w:val="single" w:color="C9D3CD" w:sz="4"/>
+            </w:tcBorders>
+            <w:shd w:fill="FAFBFA" w:color="auto" w:val="clear"/>
+            <w:tcMar>
+              <w:top w:type="dxa" w:w="80"/>
+              <w:left w:type="dxa" w:w="110"/>
+              <w:bottom w:type="dxa" w:w="80"/>
+              <w:right w:type="dxa" w:w="110"/>
+            </w:tcMar>
+          </w:tcPr>
+          <w:p>
+            <w:pPr>
+              <w:spacing w:after="0"/>
+            </w:pPr>
+            <w:r>
+              <w:rPr>
+                <w:rFonts w:ascii="Calibri" w:cs="Calibri" w:eastAsia="Calibri" w:hAnsi="Calibri"/>
+                <w:sz w:val="20"/>
+                <w:szCs w:val="20"/>
+              </w:rPr>
+              <w:t xml:space="preserve">Digitally enabled public institutions and services</w:t>
+            </w:r>
+          </w:p>
+        </w:tc>
+        <w:tc>
+          <w:tcPr>
+            <w:tcW w:type="dxa" w:w="3319"/>
+            <w:tcBorders>
+              <w:top w:val="single" w:color="C9D3CD" w:sz="4"/>
+              <w:left w:val="single" w:color="C9D3CD" w:sz="4"/>
+              <w:bottom w:val="single" w:color="C9D3CD" w:sz="4"/>
+              <w:right w:val="single" w:color="C9D3CD" w:sz="4"/>
+            </w:tcBorders>
+            <w:shd w:fill="FAFBFA" w:color="auto" w:val="clear"/>
+            <w:tcMar>
+              <w:top w:type="dxa" w:w="80"/>
+              <w:left w:type="dxa" w:w="110"/>
+              <w:bottom w:type="dxa" w:w="80"/>
+              <w:right w:type="dxa" w:w="110"/>
+            </w:tcMar>
+          </w:tcPr>
+          <w:p>
+            <w:pPr>
+              <w:spacing w:after="0"/>
+            </w:pPr>
+            <w:r>
+              <w:rPr>
+                <w:rFonts w:ascii="Calibri" w:cs="Calibri" w:eastAsia="Calibri" w:hAnsi="Calibri"/>
+                <w:sz w:val="20"/>
+                <w:szCs w:val="20"/>
+              </w:rPr>
+              <w:t xml:space="preserve">A working government platform with role-based access, governed workflows and a full audit trail</w:t>
+            </w:r>
+          </w:p>
+        </w:tc>
+      </w:tr>
+      <w:tr>
+        <w:trPr>
+          <w:cantSplit/>
+        </w:trPr>
+        <w:tc>
+          <w:tcPr>
+            <w:tcW w:type="dxa" w:w="2600"/>
+            <w:tcBorders>
+              <w:top w:val="single" w:color="C9D3CD" w:sz="4"/>
+              <w:left w:val="single" w:color="C9D3CD" w:sz="4"/>
+              <w:bottom w:val="single" w:color="C9D3CD" w:sz="4"/>
+              <w:right w:val="single" w:color="C9D3CD" w:sz="4"/>
+            </w:tcBorders>
+            <w:shd w:fill="FFFFFF" w:color="auto" w:val="clear"/>
+            <w:tcMar>
+              <w:top w:type="dxa" w:w="80"/>
+              <w:left w:type="dxa" w:w="110"/>
+              <w:bottom w:type="dxa" w:w="80"/>
+              <w:right w:type="dxa" w:w="110"/>
+            </w:tcMar>
+          </w:tcPr>
+          <w:p>
+            <w:pPr>
+              <w:spacing w:after="0"/>
+            </w:pPr>
+            <w:r>
+              <w:rPr>
+                <w:rFonts w:ascii="Calibri" w:cs="Calibri" w:eastAsia="Calibri" w:hAnsi="Calibri"/>
+                <w:sz w:val="20"/>
+                <w:szCs w:val="20"/>
+              </w:rPr>
+              <w:t xml:space="preserve">Digitalisation of government systems</w:t>
+            </w:r>
+          </w:p>
+        </w:tc>
+        <w:tc>
+          <w:tcPr>
+            <w:tcW w:type="dxa" w:w="3719"/>
+            <w:tcBorders>
+              <w:top w:val="single" w:color="C9D3CD" w:sz="4"/>
+              <w:left w:val="single" w:color="C9D3CD" w:sz="4"/>
+              <w:bottom w:val="single" w:color="C9D3CD" w:sz="4"/>
+              <w:right w:val="single" w:color="C9D3CD" w:sz="4"/>
+            </w:tcBorders>
+            <w:shd w:fill="FFFFFF" w:color="auto" w:val="clear"/>
+            <w:tcMar>
+              <w:top w:type="dxa" w:w="80"/>
+              <w:left w:type="dxa" w:w="110"/>
+              <w:bottom w:type="dxa" w:w="80"/>
+              <w:right w:type="dxa" w:w="110"/>
+            </w:tcMar>
+          </w:tcPr>
+          <w:p>
+            <w:pPr>
+              <w:spacing w:after="0"/>
+            </w:pPr>
+            <w:r>
+              <w:rPr>
+                <w:rFonts w:ascii="Calibri" w:cs="Calibri" w:eastAsia="Calibri" w:hAnsi="Calibri"/>
+                <w:sz w:val="20"/>
+                <w:szCs w:val="20"/>
+              </w:rPr>
+              <w:t xml:space="preserve">Official government identity, shared infrastructure and secure, interoperable systems</w:t>
+            </w:r>
+          </w:p>
+        </w:tc>
+        <w:tc>
+          <w:tcPr>
+            <w:tcW w:type="dxa" w:w="3319"/>
+            <w:tcBorders>
+              <w:top w:val="single" w:color="C9D3CD" w:sz="4"/>
+              <w:left w:val="single" w:color="C9D3CD" w:sz="4"/>
+              <w:bottom w:val="single" w:color="C9D3CD" w:sz="4"/>
+              <w:right w:val="single" w:color="C9D3CD" w:sz="4"/>
+            </w:tcBorders>
+            <w:shd w:fill="FFFFFF" w:color="auto" w:val="clear"/>
+            <w:tcMar>
+              <w:top w:type="dxa" w:w="80"/>
+              <w:left w:type="dxa" w:w="110"/>
+              <w:bottom w:type="dxa" w:w="80"/>
+              <w:right w:type="dxa" w:w="110"/>
+            </w:tcMar>
+          </w:tcPr>
+          <w:p>
+            <w:pPr>
+              <w:spacing w:after="0"/>
+            </w:pPr>
+            <w:r>
+              <w:rPr>
+                <w:rFonts w:ascii="Calibri" w:cs="Calibri" w:eastAsia="Calibri" w:hAnsi="Calibri"/>
+                <w:sz w:val="20"/>
+                <w:szCs w:val="20"/>
+              </w:rPr>
+              <w:t xml:space="preserve">Access restricted to official .gov.zw identities; designed to use Government’s designated domain, hosting and security services</w:t>
+            </w:r>
+          </w:p>
+        </w:tc>
+      </w:tr>
+      <w:tr>
+        <w:trPr>
+          <w:cantSplit/>
+        </w:trPr>
+        <w:tc>
+          <w:tcPr>
+            <w:tcW w:type="dxa" w:w="2600"/>
+            <w:tcBorders>
+              <w:top w:val="single" w:color="C9D3CD" w:sz="4"/>
+              <w:left w:val="single" w:color="C9D3CD" w:sz="4"/>
+              <w:bottom w:val="single" w:color="C9D3CD" w:sz="4"/>
+              <w:right w:val="single" w:color="C9D3CD" w:sz="4"/>
+            </w:tcBorders>
+            <w:shd w:fill="FAFBFA" w:color="auto" w:val="clear"/>
+            <w:tcMar>
+              <w:top w:type="dxa" w:w="80"/>
+              <w:left w:type="dxa" w:w="110"/>
+              <w:bottom w:type="dxa" w:w="80"/>
+              <w:right w:type="dxa" w:w="110"/>
+            </w:tcMar>
+          </w:tcPr>
+          <w:p>
+            <w:pPr>
+              <w:spacing w:after="0"/>
+            </w:pPr>
+            <w:r>
+              <w:rPr>
+                <w:rFonts w:ascii="Calibri" w:cs="Calibri" w:eastAsia="Calibri" w:hAnsi="Calibri"/>
+                <w:sz w:val="20"/>
+                <w:szCs w:val="20"/>
+              </w:rPr>
+              <w:t xml:space="preserve">ZIDA’s statutory mandate</w:t>
+            </w:r>
+          </w:p>
+        </w:tc>
+        <w:tc>
+          <w:tcPr>
+            <w:tcW w:type="dxa" w:w="3719"/>
+            <w:tcBorders>
+              <w:top w:val="single" w:color="C9D3CD" w:sz="4"/>
+              <w:left w:val="single" w:color="C9D3CD" w:sz="4"/>
+              <w:bottom w:val="single" w:color="C9D3CD" w:sz="4"/>
+              <w:right w:val="single" w:color="C9D3CD" w:sz="4"/>
+            </w:tcBorders>
+            <w:shd w:fill="FAFBFA" w:color="auto" w:val="clear"/>
+            <w:tcMar>
+              <w:top w:type="dxa" w:w="80"/>
+              <w:left w:type="dxa" w:w="110"/>
+              <w:bottom w:type="dxa" w:w="80"/>
+              <w:right w:type="dxa" w:w="110"/>
+            </w:tcMar>
+          </w:tcPr>
+          <w:p>
+            <w:pPr>
+              <w:spacing w:after="0"/>
+            </w:pPr>
+            <w:r>
+              <w:rPr>
+                <w:rFonts w:ascii="Calibri" w:cs="Calibri" w:eastAsia="Calibri" w:hAnsi="Calibri"/>
+                <w:sz w:val="20"/>
+                <w:szCs w:val="20"/>
+              </w:rPr>
+              <w:t xml:space="preserve">Investment promotion, facilitation and aftercare in one agency</w:t>
+            </w:r>
+          </w:p>
+        </w:tc>
+        <w:tc>
+          <w:tcPr>
+            <w:tcW w:type="dxa" w:w="3319"/>
+            <w:tcBorders>
+              <w:top w:val="single" w:color="C9D3CD" w:sz="4"/>
+              <w:left w:val="single" w:color="C9D3CD" w:sz="4"/>
+              <w:bottom w:val="single" w:color="C9D3CD" w:sz="4"/>
+              <w:right w:val="single" w:color="C9D3CD" w:sz="4"/>
+            </w:tcBorders>
+            <w:shd w:fill="FAFBFA" w:color="auto" w:val="clear"/>
+            <w:tcMar>
+              <w:top w:type="dxa" w:w="80"/>
+              <w:left w:type="dxa" w:w="110"/>
+              <w:bottom w:type="dxa" w:w="80"/>
+              <w:right w:type="dxa" w:w="110"/>
+            </w:tcMar>
+          </w:tcPr>
+          <w:p>
+            <w:pPr>
+              <w:spacing w:after="0"/>
+            </w:pPr>
+            <w:r>
+              <w:rPr>
+                <w:rFonts w:ascii="Calibri" w:cs="Calibri" w:eastAsia="Calibri" w:hAnsi="Calibri"/>
+                <w:sz w:val="20"/>
+                <w:szCs w:val="20"/>
+              </w:rPr>
+              <w:t xml:space="preserve">The operational console to publish opportunities, accredit investors and carry agreements to signature</w:t>
+            </w:r>
+          </w:p>
+        </w:tc>
+      </w:tr>
+    </w:tbl>
+    <w:p>
+      <w:pPr>
+        <w:spacing w:after="120" w:line="276"/>
+      </w:pPr>
+      <w:r>
+        <w:rPr>
+          <w:rFonts w:ascii="Calibri" w:cs="Calibri" w:eastAsia="Calibri" w:hAnsi="Calibri"/>
+          <w:sz w:val="21"/>
+          <w:szCs w:val="21"/>
+        </w:rPr>
+        <w:t xml:space="preserve"/>
+      </w:r>
+    </w:p>
+    <w:tbl>
+      <w:tblPr>
+        <w:tblW w:type="dxa" w:w="9638"/>
+        <w:tblBorders>
+          <w:top w:val="single" w:color="auto" w:sz="4"/>
+          <w:left w:val="single" w:color="auto" w:sz="4"/>
+          <w:bottom w:val="single" w:color="auto" w:sz="4"/>
+          <w:right w:val="single" w:color="auto" w:sz="4"/>
+          <w:insideH w:val="single" w:color="auto" w:sz="4"/>
+          <w:insideV w:val="single" w:color="auto" w:sz="4"/>
+        </w:tblBorders>
+        <w:tblLayout w:type="fixed"/>
+      </w:tblPr>
+      <w:tblGrid>
+        <w:gridCol w:w="2000"/>
+        <w:gridCol w:w="2800"/>
+        <w:gridCol w:w="4838"/>
+      </w:tblGrid>
+      <w:tr>
+        <w:trPr>
+          <w:tblHeader/>
+        </w:trPr>
+        <w:tc>
+          <w:tcPr>
+            <w:tcW w:type="dxa" w:w="2000"/>
+            <w:tcBorders>
+              <w:top w:val="single" w:color="C9D3CD" w:sz="4"/>
+              <w:left w:val="single" w:color="C9D3CD" w:sz="4"/>
+              <w:bottom w:val="single" w:color="C9D3CD" w:sz="4"/>
+              <w:right w:val="single" w:color="C9D3CD" w:sz="4"/>
+            </w:tcBorders>
+            <w:shd w:fill="14532D" w:color="auto" w:val="clear"/>
+            <w:tcMar>
+              <w:top w:type="dxa" w:w="80"/>
+              <w:left w:type="dxa" w:w="110"/>
+              <w:bottom w:type="dxa" w:w="80"/>
+              <w:right w:type="dxa" w:w="110"/>
+            </w:tcMar>
+          </w:tcPr>
+          <w:p>
+            <w:pPr>
+              <w:spacing w:after="0"/>
+            </w:pPr>
+            <w:r>
+              <w:rPr>
+                <w:rFonts w:ascii="Calibri" w:cs="Calibri" w:eastAsia="Calibri" w:hAnsi="Calibri"/>
+                <w:b/>
+                <w:bCs/>
+                <w:color w:val="FFFFFF"/>
+                <w:sz w:val="19"/>
+                <w:szCs w:val="19"/>
+              </w:rPr>
+              <w:t xml:space="preserve">NDAP 365-day pathway</w:t>
+            </w:r>
+          </w:p>
+        </w:tc>
+        <w:tc>
+          <w:tcPr>
+            <w:tcW w:type="dxa" w:w="2800"/>
+            <w:tcBorders>
+              <w:top w:val="single" w:color="C9D3CD" w:sz="4"/>
+              <w:left w:val="single" w:color="C9D3CD" w:sz="4"/>
+              <w:bottom w:val="single" w:color="C9D3CD" w:sz="4"/>
+              <w:right w:val="single" w:color="C9D3CD" w:sz="4"/>
+            </w:tcBorders>
+            <w:shd w:fill="14532D" w:color="auto" w:val="clear"/>
+            <w:tcMar>
+              <w:top w:type="dxa" w:w="80"/>
+              <w:left w:type="dxa" w:w="110"/>
+              <w:bottom w:type="dxa" w:w="80"/>
+              <w:right w:type="dxa" w:w="110"/>
+            </w:tcMar>
+          </w:tcPr>
+          <w:p>
+            <w:pPr>
+              <w:spacing w:after="0"/>
+            </w:pPr>
+            <w:r>
+              <w:rPr>
+                <w:rFonts w:ascii="Calibri" w:cs="Calibri" w:eastAsia="Calibri" w:hAnsi="Calibri"/>
+                <w:b/>
+                <w:bCs/>
+                <w:color w:val="FFFFFF"/>
+                <w:sz w:val="19"/>
+                <w:szCs w:val="19"/>
+              </w:rPr>
+              <w:t xml:space="preserve">Focus</w:t>
+            </w:r>
+          </w:p>
+        </w:tc>
+        <w:tc>
+          <w:tcPr>
+            <w:tcW w:type="dxa" w:w="4838"/>
+            <w:tcBorders>
+              <w:top w:val="single" w:color="C9D3CD" w:sz="4"/>
+              <w:left w:val="single" w:color="C9D3CD" w:sz="4"/>
+              <w:bottom w:val="single" w:color="C9D3CD" w:sz="4"/>
+              <w:right w:val="single" w:color="C9D3CD" w:sz="4"/>
+            </w:tcBorders>
+            <w:shd w:fill="14532D" w:color="auto" w:val="clear"/>
+            <w:tcMar>
+              <w:top w:type="dxa" w:w="80"/>
+              <w:left w:type="dxa" w:w="110"/>
+              <w:bottom w:type="dxa" w:w="80"/>
+              <w:right w:type="dxa" w:w="110"/>
+            </w:tcMar>
+          </w:tcPr>
+          <w:p>
+            <w:pPr>
+              <w:spacing w:after="0"/>
+            </w:pPr>
+            <w:r>
+              <w:rPr>
+                <w:rFonts w:ascii="Calibri" w:cs="Calibri" w:eastAsia="Calibri" w:hAnsi="Calibri"/>
+                <w:b/>
+                <w:bCs/>
+                <w:color w:val="FFFFFF"/>
+                <w:sz w:val="19"/>
+                <w:szCs w:val="19"/>
+              </w:rPr>
+              <w:t xml:space="preserve">Indicative outputs</w:t>
+            </w:r>
+          </w:p>
+        </w:tc>
+      </w:tr>
+      <w:tr>
+        <w:trPr>
+          <w:cantSplit/>
+        </w:trPr>
+        <w:tc>
+          <w:tcPr>
+            <w:tcW w:type="dxa" w:w="2000"/>
+            <w:tcBorders>
+              <w:top w:val="single" w:color="C9D3CD" w:sz="4"/>
+              <w:left w:val="single" w:color="C9D3CD" w:sz="4"/>
+              <w:bottom w:val="single" w:color="C9D3CD" w:sz="4"/>
+              <w:right w:val="single" w:color="C9D3CD" w:sz="4"/>
+            </w:tcBorders>
+            <w:shd w:fill="FAFBFA" w:color="auto" w:val="clear"/>
+            <w:tcMar>
+              <w:top w:type="dxa" w:w="80"/>
+              <w:left w:type="dxa" w:w="110"/>
+              <w:bottom w:type="dxa" w:w="80"/>
+              <w:right w:type="dxa" w:w="110"/>
+            </w:tcMar>
+          </w:tcPr>
+          <w:p>
+            <w:pPr>
+              <w:spacing w:after="0"/>
+            </w:pPr>
+            <w:r>
+              <w:rPr>
+                <w:rFonts w:ascii="Calibri" w:cs="Calibri" w:eastAsia="Calibri" w:hAnsi="Calibri"/>
+                <w:sz w:val="20"/>
+                <w:szCs w:val="20"/>
+              </w:rPr>
+              <w:t xml:space="preserve">Days 1–30 (current step)</w:t>
+            </w:r>
+          </w:p>
+        </w:tc>
+        <w:tc>
+          <w:tcPr>
+            <w:tcW w:type="dxa" w:w="2800"/>
+            <w:tcBorders>
+              <w:top w:val="single" w:color="C9D3CD" w:sz="4"/>
+              <w:left w:val="single" w:color="C9D3CD" w:sz="4"/>
+              <w:bottom w:val="single" w:color="C9D3CD" w:sz="4"/>
+              <w:right w:val="single" w:color="C9D3CD" w:sz="4"/>
+            </w:tcBorders>
+            <w:shd w:fill="FAFBFA" w:color="auto" w:val="clear"/>
+            <w:tcMar>
+              <w:top w:type="dxa" w:w="80"/>
+              <w:left w:type="dxa" w:w="110"/>
+              <w:bottom w:type="dxa" w:w="80"/>
+              <w:right w:type="dxa" w:w="110"/>
+            </w:tcMar>
+          </w:tcPr>
+          <w:p>
+            <w:pPr>
+              <w:spacing w:after="0"/>
+            </w:pPr>
+            <w:r>
+              <w:rPr>
+                <w:rFonts w:ascii="Calibri" w:cs="Calibri" w:eastAsia="Calibri" w:hAnsi="Calibri"/>
+                <w:sz w:val="20"/>
+                <w:szCs w:val="20"/>
+              </w:rPr>
+              <w:t xml:space="preserve">Assess and Align</w:t>
+            </w:r>
+          </w:p>
+        </w:tc>
+        <w:tc>
+          <w:tcPr>
+            <w:tcW w:type="dxa" w:w="4838"/>
+            <w:tcBorders>
+              <w:top w:val="single" w:color="C9D3CD" w:sz="4"/>
+              <w:left w:val="single" w:color="C9D3CD" w:sz="4"/>
+              <w:bottom w:val="single" w:color="C9D3CD" w:sz="4"/>
+              <w:right w:val="single" w:color="C9D3CD" w:sz="4"/>
+            </w:tcBorders>
+            <w:shd w:fill="FAFBFA" w:color="auto" w:val="clear"/>
+            <w:tcMar>
+              <w:top w:type="dxa" w:w="80"/>
+              <w:left w:type="dxa" w:w="110"/>
+              <w:bottom w:type="dxa" w:w="80"/>
+              <w:right w:type="dxa" w:w="110"/>
+            </w:tcMar>
+          </w:tcPr>
+          <w:p>
+            <w:pPr>
+              <w:spacing w:after="0"/>
+            </w:pPr>
+            <w:r>
+              <w:rPr>
+                <w:rFonts w:ascii="Calibri" w:cs="Calibri" w:eastAsia="Calibri" w:hAnsi="Calibri"/>
+                <w:sz w:val="20"/>
+                <w:szCs w:val="20"/>
+              </w:rPr>
+              <w:t xml:space="preserve">Stakeholder map, priority use cases, platform scope, governance model, success measures</w:t>
+            </w:r>
+          </w:p>
+        </w:tc>
+      </w:tr>
+      <w:tr>
+        <w:trPr>
+          <w:cantSplit/>
+        </w:trPr>
+        <w:tc>
+          <w:tcPr>
+            <w:tcW w:type="dxa" w:w="2000"/>
+            <w:tcBorders>
+              <w:top w:val="single" w:color="C9D3CD" w:sz="4"/>
+              <w:left w:val="single" w:color="C9D3CD" w:sz="4"/>
+              <w:bottom w:val="single" w:color="C9D3CD" w:sz="4"/>
+              <w:right w:val="single" w:color="C9D3CD" w:sz="4"/>
+            </w:tcBorders>
+            <w:shd w:fill="FFFFFF" w:color="auto" w:val="clear"/>
+            <w:tcMar>
+              <w:top w:type="dxa" w:w="80"/>
+              <w:left w:type="dxa" w:w="110"/>
+              <w:bottom w:type="dxa" w:w="80"/>
+              <w:right w:type="dxa" w:w="110"/>
+            </w:tcMar>
+          </w:tcPr>
+          <w:p>
+            <w:pPr>
+              <w:spacing w:after="0"/>
+            </w:pPr>
+            <w:r>
+              <w:rPr>
+                <w:rFonts w:ascii="Calibri" w:cs="Calibri" w:eastAsia="Calibri" w:hAnsi="Calibri"/>
+                <w:sz w:val="20"/>
+                <w:szCs w:val="20"/>
+              </w:rPr>
+              <w:t xml:space="preserve">Days 31–90</w:t>
+            </w:r>
+          </w:p>
+        </w:tc>
+        <w:tc>
+          <w:tcPr>
+            <w:tcW w:type="dxa" w:w="2800"/>
+            <w:tcBorders>
+              <w:top w:val="single" w:color="C9D3CD" w:sz="4"/>
+              <w:left w:val="single" w:color="C9D3CD" w:sz="4"/>
+              <w:bottom w:val="single" w:color="C9D3CD" w:sz="4"/>
+              <w:right w:val="single" w:color="C9D3CD" w:sz="4"/>
+            </w:tcBorders>
+            <w:shd w:fill="FFFFFF" w:color="auto" w:val="clear"/>
+            <w:tcMar>
+              <w:top w:type="dxa" w:w="80"/>
+              <w:left w:type="dxa" w:w="110"/>
+              <w:bottom w:type="dxa" w:w="80"/>
+              <w:right w:type="dxa" w:w="110"/>
+            </w:tcMar>
+          </w:tcPr>
+          <w:p>
+            <w:pPr>
+              <w:spacing w:after="0"/>
+            </w:pPr>
+            <w:r>
+              <w:rPr>
+                <w:rFonts w:ascii="Calibri" w:cs="Calibri" w:eastAsia="Calibri" w:hAnsi="Calibri"/>
+                <w:sz w:val="20"/>
+                <w:szCs w:val="20"/>
+              </w:rPr>
+              <w:t xml:space="preserve">Build First Visible Layer</w:t>
+            </w:r>
+          </w:p>
+        </w:tc>
+        <w:tc>
+          <w:tcPr>
+            <w:tcW w:type="dxa" w:w="4838"/>
+            <w:tcBorders>
+              <w:top w:val="single" w:color="C9D3CD" w:sz="4"/>
+              <w:left w:val="single" w:color="C9D3CD" w:sz="4"/>
+              <w:bottom w:val="single" w:color="C9D3CD" w:sz="4"/>
+              <w:right w:val="single" w:color="C9D3CD" w:sz="4"/>
+            </w:tcBorders>
+            <w:shd w:fill="FFFFFF" w:color="auto" w:val="clear"/>
+            <w:tcMar>
+              <w:top w:type="dxa" w:w="80"/>
+              <w:left w:type="dxa" w:w="110"/>
+              <w:bottom w:type="dxa" w:w="80"/>
+              <w:right w:type="dxa" w:w="110"/>
+            </w:tcMar>
+          </w:tcPr>
+          <w:p>
+            <w:pPr>
+              <w:spacing w:after="0"/>
+            </w:pPr>
+            <w:r>
+              <w:rPr>
+                <w:rFonts w:ascii="Calibri" w:cs="Calibri" w:eastAsia="Calibri" w:hAnsi="Calibri"/>
+                <w:sz w:val="20"/>
+                <w:szCs w:val="20"/>
+              </w:rPr>
+              <w:t xml:space="preserve">Investment platform, project registry, investor workflow, admin controls, approval gate. Delivered as a pilot and demonstrated; production deployment follows this assessment</w:t>
+            </w:r>
+          </w:p>
+        </w:tc>
+      </w:tr>
+      <w:tr>
+        <w:trPr>
+          <w:cantSplit/>
+        </w:trPr>
+        <w:tc>
+          <w:tcPr>
+            <w:tcW w:type="dxa" w:w="2000"/>
+            <w:tcBorders>
+              <w:top w:val="single" w:color="C9D3CD" w:sz="4"/>
+              <w:left w:val="single" w:color="C9D3CD" w:sz="4"/>
+              <w:bottom w:val="single" w:color="C9D3CD" w:sz="4"/>
+              <w:right w:val="single" w:color="C9D3CD" w:sz="4"/>
+            </w:tcBorders>
+            <w:shd w:fill="FAFBFA" w:color="auto" w:val="clear"/>
+            <w:tcMar>
+              <w:top w:type="dxa" w:w="80"/>
+              <w:left w:type="dxa" w:w="110"/>
+              <w:bottom w:type="dxa" w:w="80"/>
+              <w:right w:type="dxa" w:w="110"/>
+            </w:tcMar>
+          </w:tcPr>
+          <w:p>
+            <w:pPr>
+              <w:spacing w:after="0"/>
+            </w:pPr>
+            <w:r>
+              <w:rPr>
+                <w:rFonts w:ascii="Calibri" w:cs="Calibri" w:eastAsia="Calibri" w:hAnsi="Calibri"/>
+                <w:sz w:val="20"/>
+                <w:szCs w:val="20"/>
+              </w:rPr>
+              <w:t xml:space="preserve">Days 91–180</w:t>
+            </w:r>
+          </w:p>
+        </w:tc>
+        <w:tc>
+          <w:tcPr>
+            <w:tcW w:type="dxa" w:w="2800"/>
+            <w:tcBorders>
+              <w:top w:val="single" w:color="C9D3CD" w:sz="4"/>
+              <w:left w:val="single" w:color="C9D3CD" w:sz="4"/>
+              <w:bottom w:val="single" w:color="C9D3CD" w:sz="4"/>
+              <w:right w:val="single" w:color="C9D3CD" w:sz="4"/>
+            </w:tcBorders>
+            <w:shd w:fill="FAFBFA" w:color="auto" w:val="clear"/>
+            <w:tcMar>
+              <w:top w:type="dxa" w:w="80"/>
+              <w:left w:type="dxa" w:w="110"/>
+              <w:bottom w:type="dxa" w:w="80"/>
+              <w:right w:type="dxa" w:w="110"/>
+            </w:tcMar>
+          </w:tcPr>
+          <w:p>
+            <w:pPr>
+              <w:spacing w:after="0"/>
+            </w:pPr>
+            <w:r>
+              <w:rPr>
+                <w:rFonts w:ascii="Calibri" w:cs="Calibri" w:eastAsia="Calibri" w:hAnsi="Calibri"/>
+                <w:sz w:val="20"/>
+                <w:szCs w:val="20"/>
+              </w:rPr>
+              <w:t xml:space="preserve">Expand Government Enablement</w:t>
+            </w:r>
+          </w:p>
+        </w:tc>
+        <w:tc>
+          <w:tcPr>
+            <w:tcW w:type="dxa" w:w="4838"/>
+            <w:tcBorders>
+              <w:top w:val="single" w:color="C9D3CD" w:sz="4"/>
+              <w:left w:val="single" w:color="C9D3CD" w:sz="4"/>
+              <w:bottom w:val="single" w:color="C9D3CD" w:sz="4"/>
+              <w:right w:val="single" w:color="C9D3CD" w:sz="4"/>
+            </w:tcBorders>
+            <w:shd w:fill="FAFBFA" w:color="auto" w:val="clear"/>
+            <w:tcMar>
+              <w:top w:type="dxa" w:w="80"/>
+              <w:left w:type="dxa" w:w="110"/>
+              <w:bottom w:type="dxa" w:w="80"/>
+              <w:right w:type="dxa" w:w="110"/>
+            </w:tcMar>
+          </w:tcPr>
+          <w:p>
+            <w:pPr>
+              <w:spacing w:after="0"/>
+            </w:pPr>
+            <w:r>
+              <w:rPr>
+                <w:rFonts w:ascii="Calibri" w:cs="Calibri" w:eastAsia="Calibri" w:hAnsi="Calibri"/>
+                <w:sz w:val="20"/>
+                <w:szCs w:val="20"/>
+              </w:rPr>
+              <w:t xml:space="preserve">Ministry workflows, project intelligence, document vault, analytics, investor lead management</w:t>
+            </w:r>
+          </w:p>
+        </w:tc>
+      </w:tr>
+      <w:tr>
+        <w:trPr>
+          <w:cantSplit/>
+        </w:trPr>
+        <w:tc>
+          <w:tcPr>
+            <w:tcW w:type="dxa" w:w="2000"/>
+            <w:tcBorders>
+              <w:top w:val="single" w:color="C9D3CD" w:sz="4"/>
+              <w:left w:val="single" w:color="C9D3CD" w:sz="4"/>
+              <w:bottom w:val="single" w:color="C9D3CD" w:sz="4"/>
+              <w:right w:val="single" w:color="C9D3CD" w:sz="4"/>
+            </w:tcBorders>
+            <w:shd w:fill="FFFFFF" w:color="auto" w:val="clear"/>
+            <w:tcMar>
+              <w:top w:type="dxa" w:w="80"/>
+              <w:left w:type="dxa" w:w="110"/>
+              <w:bottom w:type="dxa" w:w="80"/>
+              <w:right w:type="dxa" w:w="110"/>
+            </w:tcMar>
+          </w:tcPr>
+          <w:p>
+            <w:pPr>
+              <w:spacing w:after="0"/>
+            </w:pPr>
+            <w:r>
+              <w:rPr>
+                <w:rFonts w:ascii="Calibri" w:cs="Calibri" w:eastAsia="Calibri" w:hAnsi="Calibri"/>
+                <w:sz w:val="20"/>
+                <w:szCs w:val="20"/>
+              </w:rPr>
+              <w:t xml:space="preserve">Days 181–270</w:t>
+            </w:r>
+          </w:p>
+        </w:tc>
+        <w:tc>
+          <w:tcPr>
+            <w:tcW w:type="dxa" w:w="2800"/>
+            <w:tcBorders>
+              <w:top w:val="single" w:color="C9D3CD" w:sz="4"/>
+              <w:left w:val="single" w:color="C9D3CD" w:sz="4"/>
+              <w:bottom w:val="single" w:color="C9D3CD" w:sz="4"/>
+              <w:right w:val="single" w:color="C9D3CD" w:sz="4"/>
+            </w:tcBorders>
+            <w:shd w:fill="FFFFFF" w:color="auto" w:val="clear"/>
+            <w:tcMar>
+              <w:top w:type="dxa" w:w="80"/>
+              <w:left w:type="dxa" w:w="110"/>
+              <w:bottom w:type="dxa" w:w="80"/>
+              <w:right w:type="dxa" w:w="110"/>
+            </w:tcMar>
+          </w:tcPr>
+          <w:p>
+            <w:pPr>
+              <w:spacing w:after="0"/>
+            </w:pPr>
+            <w:r>
+              <w:rPr>
+                <w:rFonts w:ascii="Calibri" w:cs="Calibri" w:eastAsia="Calibri" w:hAnsi="Calibri"/>
+                <w:sz w:val="20"/>
+                <w:szCs w:val="20"/>
+              </w:rPr>
+              <w:t xml:space="preserve">Activate Priority Digital Services</w:t>
+            </w:r>
+          </w:p>
+        </w:tc>
+        <w:tc>
+          <w:tcPr>
+            <w:tcW w:type="dxa" w:w="4838"/>
+            <w:tcBorders>
+              <w:top w:val="single" w:color="C9D3CD" w:sz="4"/>
+              <w:left w:val="single" w:color="C9D3CD" w:sz="4"/>
+              <w:bottom w:val="single" w:color="C9D3CD" w:sz="4"/>
+              <w:right w:val="single" w:color="C9D3CD" w:sz="4"/>
+            </w:tcBorders>
+            <w:shd w:fill="FFFFFF" w:color="auto" w:val="clear"/>
+            <w:tcMar>
+              <w:top w:type="dxa" w:w="80"/>
+              <w:left w:type="dxa" w:w="110"/>
+              <w:bottom w:type="dxa" w:w="80"/>
+              <w:right w:type="dxa" w:w="110"/>
+            </w:tcMar>
+          </w:tcPr>
+          <w:p>
+            <w:pPr>
+              <w:spacing w:after="0"/>
+            </w:pPr>
+            <w:r>
+              <w:rPr>
+                <w:rFonts w:ascii="Calibri" w:cs="Calibri" w:eastAsia="Calibri" w:hAnsi="Calibri"/>
+                <w:sz w:val="20"/>
+                <w:szCs w:val="20"/>
+              </w:rPr>
+              <w:t xml:space="preserve">Selected service portals, e-payment and e-tax concepts, tourism or diaspora modules, interoperability design</w:t>
+            </w:r>
+          </w:p>
+        </w:tc>
+      </w:tr>
+      <w:tr>
+        <w:trPr>
+          <w:cantSplit/>
+        </w:trPr>
+        <w:tc>
+          <w:tcPr>
+            <w:tcW w:type="dxa" w:w="2000"/>
+            <w:tcBorders>
+              <w:top w:val="single" w:color="C9D3CD" w:sz="4"/>
+              <w:left w:val="single" w:color="C9D3CD" w:sz="4"/>
+              <w:bottom w:val="single" w:color="C9D3CD" w:sz="4"/>
+              <w:right w:val="single" w:color="C9D3CD" w:sz="4"/>
+            </w:tcBorders>
+            <w:shd w:fill="FAFBFA" w:color="auto" w:val="clear"/>
+            <w:tcMar>
+              <w:top w:type="dxa" w:w="80"/>
+              <w:left w:type="dxa" w:w="110"/>
+              <w:bottom w:type="dxa" w:w="80"/>
+              <w:right w:type="dxa" w:w="110"/>
+            </w:tcMar>
+          </w:tcPr>
+          <w:p>
+            <w:pPr>
+              <w:spacing w:after="0"/>
+            </w:pPr>
+            <w:r>
+              <w:rPr>
+                <w:rFonts w:ascii="Calibri" w:cs="Calibri" w:eastAsia="Calibri" w:hAnsi="Calibri"/>
+                <w:sz w:val="20"/>
+                <w:szCs w:val="20"/>
+              </w:rPr>
+              <w:t xml:space="preserve">Days 271–365</w:t>
+            </w:r>
+          </w:p>
+        </w:tc>
+        <w:tc>
+          <w:tcPr>
+            <w:tcW w:type="dxa" w:w="2800"/>
+            <w:tcBorders>
+              <w:top w:val="single" w:color="C9D3CD" w:sz="4"/>
+              <w:left w:val="single" w:color="C9D3CD" w:sz="4"/>
+              <w:bottom w:val="single" w:color="C9D3CD" w:sz="4"/>
+              <w:right w:val="single" w:color="C9D3CD" w:sz="4"/>
+            </w:tcBorders>
+            <w:shd w:fill="FAFBFA" w:color="auto" w:val="clear"/>
+            <w:tcMar>
+              <w:top w:type="dxa" w:w="80"/>
+              <w:left w:type="dxa" w:w="110"/>
+              <w:bottom w:type="dxa" w:w="80"/>
+              <w:right w:type="dxa" w:w="110"/>
+            </w:tcMar>
+          </w:tcPr>
+          <w:p>
+            <w:pPr>
+              <w:spacing w:after="0"/>
+            </w:pPr>
+            <w:r>
+              <w:rPr>
+                <w:rFonts w:ascii="Calibri" w:cs="Calibri" w:eastAsia="Calibri" w:hAnsi="Calibri"/>
+                <w:sz w:val="20"/>
+                <w:szCs w:val="20"/>
+              </w:rPr>
+              <w:t xml:space="preserve">Institutionalise and Scale</w:t>
+            </w:r>
+          </w:p>
+        </w:tc>
+        <w:tc>
+          <w:tcPr>
+            <w:tcW w:type="dxa" w:w="4838"/>
+            <w:tcBorders>
+              <w:top w:val="single" w:color="C9D3CD" w:sz="4"/>
+              <w:left w:val="single" w:color="C9D3CD" w:sz="4"/>
+              <w:bottom w:val="single" w:color="C9D3CD" w:sz="4"/>
+              <w:right w:val="single" w:color="C9D3CD" w:sz="4"/>
+            </w:tcBorders>
+            <w:shd w:fill="FAFBFA" w:color="auto" w:val="clear"/>
+            <w:tcMar>
+              <w:top w:type="dxa" w:w="80"/>
+              <w:left w:type="dxa" w:w="110"/>
+              <w:bottom w:type="dxa" w:w="80"/>
+              <w:right w:type="dxa" w:w="110"/>
+            </w:tcMar>
+          </w:tcPr>
+          <w:p>
+            <w:pPr>
+              <w:spacing w:after="0"/>
+            </w:pPr>
+            <w:r>
+              <w:rPr>
+                <w:rFonts w:ascii="Calibri" w:cs="Calibri" w:eastAsia="Calibri" w:hAnsi="Calibri"/>
+                <w:sz w:val="20"/>
+                <w:szCs w:val="20"/>
+              </w:rPr>
+              <w:t xml:space="preserve">Training, adoption support, operating model, partnership-readiness package, scale roadmap</w:t>
+            </w:r>
+          </w:p>
+        </w:tc>
+      </w:tr>
+    </w:tbl>
+    <w:p>
+      <w:pPr>
+        <w:pStyle w:val="Heading1"/>
+        <w:keepNext/>
+        <w:pBdr>
+          <w:bottom w:val="single" w:color="B8860B" w:sz="6" w:space="4"/>
+        </w:pBdr>
+        <w:spacing w:after="120" w:before="360"/>
+      </w:pPr>
+      <w:r>
+        <w:rPr>
+          <w:rFonts w:ascii="Calibri" w:cs="Calibri" w:eastAsia="Calibri" w:hAnsi="Calibri"/>
+          <w:b/>
+          <w:bCs/>
+          <w:color w:val="14532D"/>
+          <w:sz w:val="28"/>
+          <w:szCs w:val="28"/>
+        </w:rPr>
         <w:t xml:space="preserve">How to Respond</w:t>
       </w:r>
     </w:p>
@@ -722,7 +2001,759 @@
           <w:sz w:val="28"/>
           <w:szCs w:val="28"/>
         </w:rPr>
-        <w:t xml:space="preserve">A.  Executive Sponsorship and Governance</w:t>
+        <w:t xml:space="preserve">A.  Strategic Alignment and Digital Government</w:t>
+      </w:r>
+    </w:p>
+    <w:p>
+      <w:pPr>
+        <w:keepNext/>
+        <w:spacing w:after="120" w:line="276"/>
+      </w:pPr>
+      <w:r>
+        <w:rPr>
+          <w:rFonts w:ascii="Calibri" w:cs="Calibri" w:eastAsia="Calibri" w:hAnsi="Calibri"/>
+          <w:i/>
+          <w:iCs/>
+          <w:color w:val="5F6B66"/>
+          <w:sz w:val="21"/>
+          <w:szCs w:val="21"/>
+        </w:rPr>
+        <w:t xml:space="preserve">These answers ensure the platform is implemented as part of Government’s digital transformation agenda, reported against national priorities, and positioned as the first visible layer of a wider programme rather than a standalone system.</w:t>
+      </w:r>
+    </w:p>
+    <w:tbl>
+      <w:tblPr>
+        <w:tblW w:type="dxa" w:w="9638"/>
+        <w:tblBorders>
+          <w:top w:val="single" w:color="auto" w:sz="4"/>
+          <w:left w:val="single" w:color="auto" w:sz="4"/>
+          <w:bottom w:val="single" w:color="auto" w:sz="4"/>
+          <w:right w:val="single" w:color="auto" w:sz="4"/>
+          <w:insideH w:val="single" w:color="auto" w:sz="4"/>
+          <w:insideV w:val="single" w:color="auto" w:sz="4"/>
+        </w:tblBorders>
+        <w:tblLayout w:type="fixed"/>
+      </w:tblPr>
+      <w:tblGrid>
+        <w:gridCol w:w="700"/>
+        <w:gridCol w:w="5438"/>
+        <w:gridCol w:w="3500"/>
+      </w:tblGrid>
+      <w:tr>
+        <w:trPr>
+          <w:tblHeader/>
+        </w:trPr>
+        <w:tc>
+          <w:tcPr>
+            <w:tcW w:type="dxa" w:w="700"/>
+            <w:tcBorders>
+              <w:top w:val="single" w:color="C9D3CD" w:sz="4"/>
+              <w:left w:val="single" w:color="C9D3CD" w:sz="4"/>
+              <w:bottom w:val="single" w:color="C9D3CD" w:sz="4"/>
+              <w:right w:val="single" w:color="C9D3CD" w:sz="4"/>
+            </w:tcBorders>
+            <w:shd w:fill="14532D" w:color="auto" w:val="clear"/>
+            <w:tcMar>
+              <w:top w:type="dxa" w:w="80"/>
+              <w:left w:type="dxa" w:w="110"/>
+              <w:bottom w:type="dxa" w:w="80"/>
+              <w:right w:type="dxa" w:w="110"/>
+            </w:tcMar>
+          </w:tcPr>
+          <w:p>
+            <w:pPr>
+              <w:spacing w:after="0"/>
+            </w:pPr>
+            <w:r>
+              <w:rPr>
+                <w:rFonts w:ascii="Calibri" w:cs="Calibri" w:eastAsia="Calibri" w:hAnsi="Calibri"/>
+                <w:b/>
+                <w:bCs/>
+                <w:color w:val="FFFFFF"/>
+                <w:sz w:val="19"/>
+                <w:szCs w:val="19"/>
+              </w:rPr>
+              <w:t xml:space="preserve">No.</w:t>
+            </w:r>
+          </w:p>
+        </w:tc>
+        <w:tc>
+          <w:tcPr>
+            <w:tcW w:type="dxa" w:w="5438"/>
+            <w:tcBorders>
+              <w:top w:val="single" w:color="C9D3CD" w:sz="4"/>
+              <w:left w:val="single" w:color="C9D3CD" w:sz="4"/>
+              <w:bottom w:val="single" w:color="C9D3CD" w:sz="4"/>
+              <w:right w:val="single" w:color="C9D3CD" w:sz="4"/>
+            </w:tcBorders>
+            <w:shd w:fill="14532D" w:color="auto" w:val="clear"/>
+            <w:tcMar>
+              <w:top w:type="dxa" w:w="80"/>
+              <w:left w:type="dxa" w:w="110"/>
+              <w:bottom w:type="dxa" w:w="80"/>
+              <w:right w:type="dxa" w:w="110"/>
+            </w:tcMar>
+          </w:tcPr>
+          <w:p>
+            <w:pPr>
+              <w:spacing w:after="0"/>
+            </w:pPr>
+            <w:r>
+              <w:rPr>
+                <w:rFonts w:ascii="Calibri" w:cs="Calibri" w:eastAsia="Calibri" w:hAnsi="Calibri"/>
+                <w:b/>
+                <w:bCs/>
+                <w:color w:val="FFFFFF"/>
+                <w:sz w:val="19"/>
+                <w:szCs w:val="19"/>
+              </w:rPr>
+              <w:t xml:space="preserve">Question</w:t>
+            </w:r>
+          </w:p>
+        </w:tc>
+        <w:tc>
+          <w:tcPr>
+            <w:tcW w:type="dxa" w:w="3500"/>
+            <w:tcBorders>
+              <w:top w:val="single" w:color="C9D3CD" w:sz="4"/>
+              <w:left w:val="single" w:color="C9D3CD" w:sz="4"/>
+              <w:bottom w:val="single" w:color="C9D3CD" w:sz="4"/>
+              <w:right w:val="single" w:color="C9D3CD" w:sz="4"/>
+            </w:tcBorders>
+            <w:shd w:fill="14532D" w:color="auto" w:val="clear"/>
+            <w:tcMar>
+              <w:top w:type="dxa" w:w="80"/>
+              <w:left w:type="dxa" w:w="110"/>
+              <w:bottom w:type="dxa" w:w="80"/>
+              <w:right w:type="dxa" w:w="110"/>
+            </w:tcMar>
+          </w:tcPr>
+          <w:p>
+            <w:pPr>
+              <w:spacing w:after="0"/>
+            </w:pPr>
+            <w:r>
+              <w:rPr>
+                <w:rFonts w:ascii="Calibri" w:cs="Calibri" w:eastAsia="Calibri" w:hAnsi="Calibri"/>
+                <w:b/>
+                <w:bCs/>
+                <w:color w:val="FFFFFF"/>
+                <w:sz w:val="19"/>
+                <w:szCs w:val="19"/>
+              </w:rPr>
+              <w:t xml:space="preserve">Response</w:t>
+            </w:r>
+          </w:p>
+        </w:tc>
+      </w:tr>
+      <w:tr>
+        <w:trPr>
+          <w:cantSplit/>
+        </w:trPr>
+        <w:tc>
+          <w:tcPr>
+            <w:tcW w:type="dxa" w:w="700"/>
+            <w:tcBorders>
+              <w:top w:val="single" w:color="C9D3CD" w:sz="4"/>
+              <w:left w:val="single" w:color="C9D3CD" w:sz="4"/>
+              <w:bottom w:val="single" w:color="C9D3CD" w:sz="4"/>
+              <w:right w:val="single" w:color="C9D3CD" w:sz="4"/>
+            </w:tcBorders>
+            <w:shd w:fill="FAFBFA" w:color="auto" w:val="clear"/>
+            <w:tcMar>
+              <w:top w:type="dxa" w:w="80"/>
+              <w:left w:type="dxa" w:w="110"/>
+              <w:bottom w:type="dxa" w:w="80"/>
+              <w:right w:type="dxa" w:w="110"/>
+            </w:tcMar>
+          </w:tcPr>
+          <w:p>
+            <w:pPr>
+              <w:spacing w:after="0"/>
+            </w:pPr>
+            <w:r>
+              <w:rPr>
+                <w:rFonts w:ascii="Calibri" w:cs="Calibri" w:eastAsia="Calibri" w:hAnsi="Calibri"/>
+                <w:sz w:val="20"/>
+                <w:szCs w:val="20"/>
+              </w:rPr>
+              <w:t xml:space="preserve">A1</w:t>
+            </w:r>
+          </w:p>
+        </w:tc>
+        <w:tc>
+          <w:tcPr>
+            <w:tcW w:type="dxa" w:w="5438"/>
+            <w:tcBorders>
+              <w:top w:val="single" w:color="C9D3CD" w:sz="4"/>
+              <w:left w:val="single" w:color="C9D3CD" w:sz="4"/>
+              <w:bottom w:val="single" w:color="C9D3CD" w:sz="4"/>
+              <w:right w:val="single" w:color="C9D3CD" w:sz="4"/>
+            </w:tcBorders>
+            <w:shd w:fill="FAFBFA" w:color="auto" w:val="clear"/>
+            <w:tcMar>
+              <w:top w:type="dxa" w:w="80"/>
+              <w:left w:type="dxa" w:w="110"/>
+              <w:bottom w:type="dxa" w:w="80"/>
+              <w:right w:type="dxa" w:w="110"/>
+            </w:tcMar>
+          </w:tcPr>
+          <w:p>
+            <w:pPr>
+              <w:spacing w:after="0"/>
+            </w:pPr>
+            <w:r>
+              <w:rPr>
+                <w:rFonts w:ascii="Calibri" w:cs="Calibri" w:eastAsia="Calibri" w:hAnsi="Calibri"/>
+                <w:sz w:val="20"/>
+                <w:szCs w:val="20"/>
+              </w:rPr>
+              <w:t xml:space="preserve">Which national strategies, frameworks or standards must the platform formally align with (for example, Vision 2030, NDS2, the Smart Zimbabwe 2030 Master Plan, or any e-government, interoperability or data-governance framework)?</w:t>
+            </w:r>
+          </w:p>
+        </w:tc>
+        <w:tc>
+          <w:tcPr>
+            <w:tcW w:type="dxa" w:w="3500"/>
+            <w:tcBorders>
+              <w:top w:val="single" w:color="C9D3CD" w:sz="4"/>
+              <w:left w:val="single" w:color="C9D3CD" w:sz="4"/>
+              <w:bottom w:val="single" w:color="C9D3CD" w:sz="4"/>
+              <w:right w:val="single" w:color="C9D3CD" w:sz="4"/>
+            </w:tcBorders>
+            <w:shd w:fill="FAFBFA" w:color="auto" w:val="clear"/>
+            <w:tcMar>
+              <w:top w:type="dxa" w:w="80"/>
+              <w:left w:type="dxa" w:w="110"/>
+              <w:bottom w:type="dxa" w:w="80"/>
+              <w:right w:type="dxa" w:w="110"/>
+            </w:tcMar>
+          </w:tcPr>
+          <w:p>
+            <w:pPr>
+              <w:spacing w:after="0"/>
+            </w:pPr>
+            <w:r>
+              <w:rPr>
+                <w:rFonts w:ascii="Calibri" w:cs="Calibri" w:eastAsia="Calibri" w:hAnsi="Calibri"/>
+                <w:sz w:val="20"/>
+                <w:szCs w:val="20"/>
+              </w:rPr>
+              <w:t xml:space="preserve"/>
+            </w:r>
+          </w:p>
+        </w:tc>
+      </w:tr>
+      <w:tr>
+        <w:trPr>
+          <w:cantSplit/>
+        </w:trPr>
+        <w:tc>
+          <w:tcPr>
+            <w:tcW w:type="dxa" w:w="700"/>
+            <w:tcBorders>
+              <w:top w:val="single" w:color="C9D3CD" w:sz="4"/>
+              <w:left w:val="single" w:color="C9D3CD" w:sz="4"/>
+              <w:bottom w:val="single" w:color="C9D3CD" w:sz="4"/>
+              <w:right w:val="single" w:color="C9D3CD" w:sz="4"/>
+            </w:tcBorders>
+            <w:shd w:fill="FFFFFF" w:color="auto" w:val="clear"/>
+            <w:tcMar>
+              <w:top w:type="dxa" w:w="80"/>
+              <w:left w:type="dxa" w:w="110"/>
+              <w:bottom w:type="dxa" w:w="80"/>
+              <w:right w:type="dxa" w:w="110"/>
+            </w:tcMar>
+          </w:tcPr>
+          <w:p>
+            <w:pPr>
+              <w:spacing w:after="0"/>
+            </w:pPr>
+            <w:r>
+              <w:rPr>
+                <w:rFonts w:ascii="Calibri" w:cs="Calibri" w:eastAsia="Calibri" w:hAnsi="Calibri"/>
+                <w:sz w:val="20"/>
+                <w:szCs w:val="20"/>
+              </w:rPr>
+              <w:t xml:space="preserve">A2</w:t>
+            </w:r>
+          </w:p>
+        </w:tc>
+        <w:tc>
+          <w:tcPr>
+            <w:tcW w:type="dxa" w:w="5438"/>
+            <w:tcBorders>
+              <w:top w:val="single" w:color="C9D3CD" w:sz="4"/>
+              <w:left w:val="single" w:color="C9D3CD" w:sz="4"/>
+              <w:bottom w:val="single" w:color="C9D3CD" w:sz="4"/>
+              <w:right w:val="single" w:color="C9D3CD" w:sz="4"/>
+            </w:tcBorders>
+            <w:shd w:fill="FFFFFF" w:color="auto" w:val="clear"/>
+            <w:tcMar>
+              <w:top w:type="dxa" w:w="80"/>
+              <w:left w:type="dxa" w:w="110"/>
+              <w:bottom w:type="dxa" w:w="80"/>
+              <w:right w:type="dxa" w:w="110"/>
+            </w:tcMar>
+          </w:tcPr>
+          <w:p>
+            <w:pPr>
+              <w:spacing w:after="0"/>
+            </w:pPr>
+            <w:r>
+              <w:rPr>
+                <w:rFonts w:ascii="Calibri" w:cs="Calibri" w:eastAsia="Calibri" w:hAnsi="Calibri"/>
+                <w:sz w:val="20"/>
+                <w:szCs w:val="20"/>
+              </w:rPr>
+              <w:t xml:space="preserve">Must the Ministry of ICT, Postal and Courier Services, or GISP, review or endorse the platform as part of Government’s digitalisation of its systems? If so, which unit or official should we engage?</w:t>
+            </w:r>
+          </w:p>
+        </w:tc>
+        <w:tc>
+          <w:tcPr>
+            <w:tcW w:type="dxa" w:w="3500"/>
+            <w:tcBorders>
+              <w:top w:val="single" w:color="C9D3CD" w:sz="4"/>
+              <w:left w:val="single" w:color="C9D3CD" w:sz="4"/>
+              <w:bottom w:val="single" w:color="C9D3CD" w:sz="4"/>
+              <w:right w:val="single" w:color="C9D3CD" w:sz="4"/>
+            </w:tcBorders>
+            <w:shd w:fill="FFFFFF" w:color="auto" w:val="clear"/>
+            <w:tcMar>
+              <w:top w:type="dxa" w:w="80"/>
+              <w:left w:type="dxa" w:w="110"/>
+              <w:bottom w:type="dxa" w:w="80"/>
+              <w:right w:type="dxa" w:w="110"/>
+            </w:tcMar>
+          </w:tcPr>
+          <w:p>
+            <w:pPr>
+              <w:spacing w:after="0"/>
+            </w:pPr>
+            <w:r>
+              <w:rPr>
+                <w:rFonts w:ascii="Calibri" w:cs="Calibri" w:eastAsia="Calibri" w:hAnsi="Calibri"/>
+                <w:sz w:val="20"/>
+                <w:szCs w:val="20"/>
+              </w:rPr>
+              <w:t xml:space="preserve"/>
+            </w:r>
+          </w:p>
+        </w:tc>
+      </w:tr>
+      <w:tr>
+        <w:trPr>
+          <w:cantSplit/>
+        </w:trPr>
+        <w:tc>
+          <w:tcPr>
+            <w:tcW w:type="dxa" w:w="700"/>
+            <w:tcBorders>
+              <w:top w:val="single" w:color="C9D3CD" w:sz="4"/>
+              <w:left w:val="single" w:color="C9D3CD" w:sz="4"/>
+              <w:bottom w:val="single" w:color="C9D3CD" w:sz="4"/>
+              <w:right w:val="single" w:color="C9D3CD" w:sz="4"/>
+            </w:tcBorders>
+            <w:shd w:fill="FAFBFA" w:color="auto" w:val="clear"/>
+            <w:tcMar>
+              <w:top w:type="dxa" w:w="80"/>
+              <w:left w:type="dxa" w:w="110"/>
+              <w:bottom w:type="dxa" w:w="80"/>
+              <w:right w:type="dxa" w:w="110"/>
+            </w:tcMar>
+          </w:tcPr>
+          <w:p>
+            <w:pPr>
+              <w:spacing w:after="0"/>
+            </w:pPr>
+            <w:r>
+              <w:rPr>
+                <w:rFonts w:ascii="Calibri" w:cs="Calibri" w:eastAsia="Calibri" w:hAnsi="Calibri"/>
+                <w:sz w:val="20"/>
+                <w:szCs w:val="20"/>
+              </w:rPr>
+              <w:t xml:space="preserve">A3</w:t>
+            </w:r>
+          </w:p>
+        </w:tc>
+        <w:tc>
+          <w:tcPr>
+            <w:tcW w:type="dxa" w:w="5438"/>
+            <w:tcBorders>
+              <w:top w:val="single" w:color="C9D3CD" w:sz="4"/>
+              <w:left w:val="single" w:color="C9D3CD" w:sz="4"/>
+              <w:bottom w:val="single" w:color="C9D3CD" w:sz="4"/>
+              <w:right w:val="single" w:color="C9D3CD" w:sz="4"/>
+            </w:tcBorders>
+            <w:shd w:fill="FAFBFA" w:color="auto" w:val="clear"/>
+            <w:tcMar>
+              <w:top w:type="dxa" w:w="80"/>
+              <w:left w:type="dxa" w:w="110"/>
+              <w:bottom w:type="dxa" w:w="80"/>
+              <w:right w:type="dxa" w:w="110"/>
+            </w:tcMar>
+          </w:tcPr>
+          <w:p>
+            <w:pPr>
+              <w:spacing w:after="0"/>
+            </w:pPr>
+            <w:r>
+              <w:rPr>
+                <w:rFonts w:ascii="Calibri" w:cs="Calibri" w:eastAsia="Calibri" w:hAnsi="Calibri"/>
+                <w:sz w:val="20"/>
+                <w:szCs w:val="20"/>
+              </w:rPr>
+              <w:t xml:space="preserve">Is there a national digital-government programme, office or committee the platform should be registered with or report progress to?</w:t>
+            </w:r>
+          </w:p>
+        </w:tc>
+        <w:tc>
+          <w:tcPr>
+            <w:tcW w:type="dxa" w:w="3500"/>
+            <w:tcBorders>
+              <w:top w:val="single" w:color="C9D3CD" w:sz="4"/>
+              <w:left w:val="single" w:color="C9D3CD" w:sz="4"/>
+              <w:bottom w:val="single" w:color="C9D3CD" w:sz="4"/>
+              <w:right w:val="single" w:color="C9D3CD" w:sz="4"/>
+            </w:tcBorders>
+            <w:shd w:fill="FAFBFA" w:color="auto" w:val="clear"/>
+            <w:tcMar>
+              <w:top w:type="dxa" w:w="80"/>
+              <w:left w:type="dxa" w:w="110"/>
+              <w:bottom w:type="dxa" w:w="80"/>
+              <w:right w:type="dxa" w:w="110"/>
+            </w:tcMar>
+          </w:tcPr>
+          <w:p>
+            <w:pPr>
+              <w:spacing w:after="0"/>
+            </w:pPr>
+            <w:r>
+              <w:rPr>
+                <w:rFonts w:ascii="Calibri" w:cs="Calibri" w:eastAsia="Calibri" w:hAnsi="Calibri"/>
+                <w:sz w:val="20"/>
+                <w:szCs w:val="20"/>
+              </w:rPr>
+              <w:t xml:space="preserve"/>
+            </w:r>
+          </w:p>
+        </w:tc>
+      </w:tr>
+      <w:tr>
+        <w:trPr>
+          <w:cantSplit/>
+        </w:trPr>
+        <w:tc>
+          <w:tcPr>
+            <w:tcW w:type="dxa" w:w="700"/>
+            <w:tcBorders>
+              <w:top w:val="single" w:color="C9D3CD" w:sz="4"/>
+              <w:left w:val="single" w:color="C9D3CD" w:sz="4"/>
+              <w:bottom w:val="single" w:color="C9D3CD" w:sz="4"/>
+              <w:right w:val="single" w:color="C9D3CD" w:sz="4"/>
+            </w:tcBorders>
+            <w:shd w:fill="FFFFFF" w:color="auto" w:val="clear"/>
+            <w:tcMar>
+              <w:top w:type="dxa" w:w="80"/>
+              <w:left w:type="dxa" w:w="110"/>
+              <w:bottom w:type="dxa" w:w="80"/>
+              <w:right w:type="dxa" w:w="110"/>
+            </w:tcMar>
+          </w:tcPr>
+          <w:p>
+            <w:pPr>
+              <w:spacing w:after="0"/>
+            </w:pPr>
+            <w:r>
+              <w:rPr>
+                <w:rFonts w:ascii="Calibri" w:cs="Calibri" w:eastAsia="Calibri" w:hAnsi="Calibri"/>
+                <w:sz w:val="20"/>
+                <w:szCs w:val="20"/>
+              </w:rPr>
+              <w:t xml:space="preserve">A4</w:t>
+            </w:r>
+          </w:p>
+        </w:tc>
+        <w:tc>
+          <w:tcPr>
+            <w:tcW w:type="dxa" w:w="5438"/>
+            <w:tcBorders>
+              <w:top w:val="single" w:color="C9D3CD" w:sz="4"/>
+              <w:left w:val="single" w:color="C9D3CD" w:sz="4"/>
+              <w:bottom w:val="single" w:color="C9D3CD" w:sz="4"/>
+              <w:right w:val="single" w:color="C9D3CD" w:sz="4"/>
+            </w:tcBorders>
+            <w:shd w:fill="FFFFFF" w:color="auto" w:val="clear"/>
+            <w:tcMar>
+              <w:top w:type="dxa" w:w="80"/>
+              <w:left w:type="dxa" w:w="110"/>
+              <w:bottom w:type="dxa" w:w="80"/>
+              <w:right w:type="dxa" w:w="110"/>
+            </w:tcMar>
+          </w:tcPr>
+          <w:p>
+            <w:pPr>
+              <w:spacing w:after="0"/>
+            </w:pPr>
+            <w:r>
+              <w:rPr>
+                <w:rFonts w:ascii="Calibri" w:cs="Calibri" w:eastAsia="Calibri" w:hAnsi="Calibri"/>
+                <w:sz w:val="20"/>
+                <w:szCs w:val="20"/>
+              </w:rPr>
+              <w:t xml:space="preserve">Which NDS2 priorities or Vision 2030 targets should the platform’s performance indicators report against?</w:t>
+            </w:r>
+          </w:p>
+        </w:tc>
+        <w:tc>
+          <w:tcPr>
+            <w:tcW w:type="dxa" w:w="3500"/>
+            <w:tcBorders>
+              <w:top w:val="single" w:color="C9D3CD" w:sz="4"/>
+              <w:left w:val="single" w:color="C9D3CD" w:sz="4"/>
+              <w:bottom w:val="single" w:color="C9D3CD" w:sz="4"/>
+              <w:right w:val="single" w:color="C9D3CD" w:sz="4"/>
+            </w:tcBorders>
+            <w:shd w:fill="FFFFFF" w:color="auto" w:val="clear"/>
+            <w:tcMar>
+              <w:top w:type="dxa" w:w="80"/>
+              <w:left w:type="dxa" w:w="110"/>
+              <w:bottom w:type="dxa" w:w="80"/>
+              <w:right w:type="dxa" w:w="110"/>
+            </w:tcMar>
+          </w:tcPr>
+          <w:p>
+            <w:pPr>
+              <w:spacing w:after="0"/>
+            </w:pPr>
+            <w:r>
+              <w:rPr>
+                <w:rFonts w:ascii="Calibri" w:cs="Calibri" w:eastAsia="Calibri" w:hAnsi="Calibri"/>
+                <w:sz w:val="20"/>
+                <w:szCs w:val="20"/>
+              </w:rPr>
+              <w:t xml:space="preserve"/>
+            </w:r>
+          </w:p>
+        </w:tc>
+      </w:tr>
+      <w:tr>
+        <w:trPr>
+          <w:cantSplit/>
+        </w:trPr>
+        <w:tc>
+          <w:tcPr>
+            <w:tcW w:type="dxa" w:w="700"/>
+            <w:tcBorders>
+              <w:top w:val="single" w:color="C9D3CD" w:sz="4"/>
+              <w:left w:val="single" w:color="C9D3CD" w:sz="4"/>
+              <w:bottom w:val="single" w:color="C9D3CD" w:sz="4"/>
+              <w:right w:val="single" w:color="C9D3CD" w:sz="4"/>
+            </w:tcBorders>
+            <w:shd w:fill="FAFBFA" w:color="auto" w:val="clear"/>
+            <w:tcMar>
+              <w:top w:type="dxa" w:w="80"/>
+              <w:left w:type="dxa" w:w="110"/>
+              <w:bottom w:type="dxa" w:w="80"/>
+              <w:right w:type="dxa" w:w="110"/>
+            </w:tcMar>
+          </w:tcPr>
+          <w:p>
+            <w:pPr>
+              <w:spacing w:after="0"/>
+            </w:pPr>
+            <w:r>
+              <w:rPr>
+                <w:rFonts w:ascii="Calibri" w:cs="Calibri" w:eastAsia="Calibri" w:hAnsi="Calibri"/>
+                <w:sz w:val="20"/>
+                <w:szCs w:val="20"/>
+              </w:rPr>
+              <w:t xml:space="preserve">A5</w:t>
+            </w:r>
+          </w:p>
+        </w:tc>
+        <w:tc>
+          <w:tcPr>
+            <w:tcW w:type="dxa" w:w="5438"/>
+            <w:tcBorders>
+              <w:top w:val="single" w:color="C9D3CD" w:sz="4"/>
+              <w:left w:val="single" w:color="C9D3CD" w:sz="4"/>
+              <w:bottom w:val="single" w:color="C9D3CD" w:sz="4"/>
+              <w:right w:val="single" w:color="C9D3CD" w:sz="4"/>
+            </w:tcBorders>
+            <w:shd w:fill="FAFBFA" w:color="auto" w:val="clear"/>
+            <w:tcMar>
+              <w:top w:type="dxa" w:w="80"/>
+              <w:left w:type="dxa" w:w="110"/>
+              <w:bottom w:type="dxa" w:w="80"/>
+              <w:right w:type="dxa" w:w="110"/>
+            </w:tcMar>
+          </w:tcPr>
+          <w:p>
+            <w:pPr>
+              <w:spacing w:after="0"/>
+            </w:pPr>
+            <w:r>
+              <w:rPr>
+                <w:rFonts w:ascii="Calibri" w:cs="Calibri" w:eastAsia="Calibri" w:hAnsi="Calibri"/>
+                <w:sz w:val="20"/>
+                <w:szCs w:val="20"/>
+              </w:rPr>
+              <w:t xml:space="preserve">Are other government digital initiatives under way (for example, e-services portals, digital identity or data-exchange projects) with which the platform should align or share infrastructure?</w:t>
+            </w:r>
+          </w:p>
+        </w:tc>
+        <w:tc>
+          <w:tcPr>
+            <w:tcW w:type="dxa" w:w="3500"/>
+            <w:tcBorders>
+              <w:top w:val="single" w:color="C9D3CD" w:sz="4"/>
+              <w:left w:val="single" w:color="C9D3CD" w:sz="4"/>
+              <w:bottom w:val="single" w:color="C9D3CD" w:sz="4"/>
+              <w:right w:val="single" w:color="C9D3CD" w:sz="4"/>
+            </w:tcBorders>
+            <w:shd w:fill="FAFBFA" w:color="auto" w:val="clear"/>
+            <w:tcMar>
+              <w:top w:type="dxa" w:w="80"/>
+              <w:left w:type="dxa" w:w="110"/>
+              <w:bottom w:type="dxa" w:w="80"/>
+              <w:right w:type="dxa" w:w="110"/>
+            </w:tcMar>
+          </w:tcPr>
+          <w:p>
+            <w:pPr>
+              <w:spacing w:after="0"/>
+            </w:pPr>
+            <w:r>
+              <w:rPr>
+                <w:rFonts w:ascii="Calibri" w:cs="Calibri" w:eastAsia="Calibri" w:hAnsi="Calibri"/>
+                <w:sz w:val="20"/>
+                <w:szCs w:val="20"/>
+              </w:rPr>
+              <w:t xml:space="preserve"/>
+            </w:r>
+          </w:p>
+        </w:tc>
+      </w:tr>
+      <w:tr>
+        <w:trPr>
+          <w:cantSplit/>
+        </w:trPr>
+        <w:tc>
+          <w:tcPr>
+            <w:tcW w:type="dxa" w:w="700"/>
+            <w:tcBorders>
+              <w:top w:val="single" w:color="C9D3CD" w:sz="4"/>
+              <w:left w:val="single" w:color="C9D3CD" w:sz="4"/>
+              <w:bottom w:val="single" w:color="C9D3CD" w:sz="4"/>
+              <w:right w:val="single" w:color="C9D3CD" w:sz="4"/>
+            </w:tcBorders>
+            <w:shd w:fill="FFFFFF" w:color="auto" w:val="clear"/>
+            <w:tcMar>
+              <w:top w:type="dxa" w:w="80"/>
+              <w:left w:type="dxa" w:w="110"/>
+              <w:bottom w:type="dxa" w:w="80"/>
+              <w:right w:type="dxa" w:w="110"/>
+            </w:tcMar>
+          </w:tcPr>
+          <w:p>
+            <w:pPr>
+              <w:spacing w:after="0"/>
+            </w:pPr>
+            <w:r>
+              <w:rPr>
+                <w:rFonts w:ascii="Calibri" w:cs="Calibri" w:eastAsia="Calibri" w:hAnsi="Calibri"/>
+                <w:sz w:val="20"/>
+                <w:szCs w:val="20"/>
+              </w:rPr>
+              <w:t xml:space="preserve">A6</w:t>
+            </w:r>
+          </w:p>
+        </w:tc>
+        <w:tc>
+          <w:tcPr>
+            <w:tcW w:type="dxa" w:w="5438"/>
+            <w:tcBorders>
+              <w:top w:val="single" w:color="C9D3CD" w:sz="4"/>
+              <w:left w:val="single" w:color="C9D3CD" w:sz="4"/>
+              <w:bottom w:val="single" w:color="C9D3CD" w:sz="4"/>
+              <w:right w:val="single" w:color="C9D3CD" w:sz="4"/>
+            </w:tcBorders>
+            <w:shd w:fill="FFFFFF" w:color="auto" w:val="clear"/>
+            <w:tcMar>
+              <w:top w:type="dxa" w:w="80"/>
+              <w:left w:type="dxa" w:w="110"/>
+              <w:bottom w:type="dxa" w:w="80"/>
+              <w:right w:type="dxa" w:w="110"/>
+            </w:tcMar>
+          </w:tcPr>
+          <w:p>
+            <w:pPr>
+              <w:spacing w:after="0"/>
+            </w:pPr>
+            <w:r>
+              <w:rPr>
+                <w:rFonts w:ascii="Calibri" w:cs="Calibri" w:eastAsia="Calibri" w:hAnsi="Calibri"/>
+                <w:sz w:val="20"/>
+                <w:szCs w:val="20"/>
+              </w:rPr>
+              <w:t xml:space="preserve">Beyond investment promotion, which National Digital Acceleration Program workstreams would Government like considered in the roadmap: digital government services, interoperability and secure data exchange, e-payments and e-tax, secure documents and records, tourism, embassy and diaspora systems, or data and AI decision support?</w:t>
+            </w:r>
+          </w:p>
+        </w:tc>
+        <w:tc>
+          <w:tcPr>
+            <w:tcW w:type="dxa" w:w="3500"/>
+            <w:tcBorders>
+              <w:top w:val="single" w:color="C9D3CD" w:sz="4"/>
+              <w:left w:val="single" w:color="C9D3CD" w:sz="4"/>
+              <w:bottom w:val="single" w:color="C9D3CD" w:sz="4"/>
+              <w:right w:val="single" w:color="C9D3CD" w:sz="4"/>
+            </w:tcBorders>
+            <w:shd w:fill="FFFFFF" w:color="auto" w:val="clear"/>
+            <w:tcMar>
+              <w:top w:type="dxa" w:w="80"/>
+              <w:left w:type="dxa" w:w="110"/>
+              <w:bottom w:type="dxa" w:w="80"/>
+              <w:right w:type="dxa" w:w="110"/>
+            </w:tcMar>
+          </w:tcPr>
+          <w:p>
+            <w:pPr>
+              <w:spacing w:after="0"/>
+            </w:pPr>
+            <w:r>
+              <w:rPr>
+                <w:rFonts w:ascii="Calibri" w:cs="Calibri" w:eastAsia="Calibri" w:hAnsi="Calibri"/>
+                <w:sz w:val="20"/>
+                <w:szCs w:val="20"/>
+              </w:rPr>
+              <w:t xml:space="preserve"/>
+            </w:r>
+          </w:p>
+        </w:tc>
+      </w:tr>
+    </w:tbl>
+    <w:p>
+      <w:pPr>
+        <w:pStyle w:val="Heading1"/>
+        <w:keepNext/>
+        <w:pBdr>
+          <w:bottom w:val="single" w:color="B8860B" w:sz="6" w:space="4"/>
+        </w:pBdr>
+        <w:spacing w:after="120" w:before="360"/>
+      </w:pPr>
+      <w:r>
+        <w:rPr>
+          <w:rFonts w:ascii="Calibri" w:cs="Calibri" w:eastAsia="Calibri" w:hAnsi="Calibri"/>
+          <w:b/>
+          <w:bCs/>
+          <w:color w:val="14532D"/>
+          <w:sz w:val="28"/>
+          <w:szCs w:val="28"/>
+        </w:rPr>
+        <w:t xml:space="preserve">B.  Executive Sponsorship and Governance</w:t>
       </w:r>
     </w:p>
     <w:p>
@@ -898,7 +2929,7 @@
                 <w:sz w:val="20"/>
                 <w:szCs w:val="20"/>
               </w:rPr>
-              <w:t xml:space="preserve">A1</w:t>
+              <w:t xml:space="preserve">B1</w:t>
             </w:r>
           </w:p>
         </w:tc>
@@ -996,7 +3027,7 @@
                 <w:sz w:val="20"/>
                 <w:szCs w:val="20"/>
               </w:rPr>
-              <w:t xml:space="preserve">A2</w:t>
+              <w:t xml:space="preserve">B2</w:t>
             </w:r>
           </w:p>
         </w:tc>
@@ -1094,7 +3125,7 @@
                 <w:sz w:val="20"/>
                 <w:szCs w:val="20"/>
               </w:rPr>
-              <w:t xml:space="preserve">A3</w:t>
+              <w:t xml:space="preserve">B3</w:t>
             </w:r>
           </w:p>
         </w:tc>
@@ -1192,7 +3223,7 @@
                 <w:sz w:val="20"/>
                 <w:szCs w:val="20"/>
               </w:rPr>
-              <w:t xml:space="preserve">A4</w:t>
+              <w:t xml:space="preserve">B4</w:t>
             </w:r>
           </w:p>
         </w:tc>
@@ -1290,7 +3321,7 @@
                 <w:sz w:val="20"/>
                 <w:szCs w:val="20"/>
               </w:rPr>
-              <w:t xml:space="preserve">A5</w:t>
+              <w:t xml:space="preserve">B5</w:t>
             </w:r>
           </w:p>
         </w:tc>
@@ -1388,7 +3419,7 @@
                 <w:sz w:val="20"/>
                 <w:szCs w:val="20"/>
               </w:rPr>
-              <w:t xml:space="preserve">A6</w:t>
+              <w:t xml:space="preserve">B6</w:t>
             </w:r>
           </w:p>
         </w:tc>
@@ -1486,7 +3517,7 @@
                 <w:sz w:val="20"/>
                 <w:szCs w:val="20"/>
               </w:rPr>
-              <w:t xml:space="preserve">A7</w:t>
+              <w:t xml:space="preserve">B7</w:t>
             </w:r>
           </w:p>
         </w:tc>
@@ -1584,7 +3615,7 @@
                 <w:sz w:val="20"/>
                 <w:szCs w:val="20"/>
               </w:rPr>
-              <w:t xml:space="preserve">A8</w:t>
+              <w:t xml:space="preserve">B8</w:t>
             </w:r>
           </w:p>
         </w:tc>
@@ -1670,7 +3701,7 @@
           <w:sz w:val="28"/>
           <w:szCs w:val="28"/>
         </w:rPr>
-        <w:t xml:space="preserve">B.  Procurement and Commercial Framework</w:t>
+        <w:t xml:space="preserve">C.  Procurement and Commercial Framework</w:t>
       </w:r>
     </w:p>
     <w:p>
@@ -1846,7 +3877,7 @@
                 <w:sz w:val="20"/>
                 <w:szCs w:val="20"/>
               </w:rPr>
-              <w:t xml:space="preserve">B1</w:t>
+              <w:t xml:space="preserve">C1</w:t>
             </w:r>
           </w:p>
         </w:tc>
@@ -1944,7 +3975,7 @@
                 <w:sz w:val="20"/>
                 <w:szCs w:val="20"/>
               </w:rPr>
-              <w:t xml:space="preserve">B2</w:t>
+              <w:t xml:space="preserve">C2</w:t>
             </w:r>
           </w:p>
         </w:tc>
@@ -2042,7 +4073,7 @@
                 <w:sz w:val="20"/>
                 <w:szCs w:val="20"/>
               </w:rPr>
-              <w:t xml:space="preserve">B3</w:t>
+              <w:t xml:space="preserve">C3</w:t>
             </w:r>
           </w:p>
         </w:tc>
@@ -2140,7 +4171,7 @@
                 <w:sz w:val="20"/>
                 <w:szCs w:val="20"/>
               </w:rPr>
-              <w:t xml:space="preserve">B4</w:t>
+              <w:t xml:space="preserve">C4</w:t>
             </w:r>
           </w:p>
         </w:tc>
@@ -2238,7 +4269,7 @@
                 <w:sz w:val="20"/>
                 <w:szCs w:val="20"/>
               </w:rPr>
-              <w:t xml:space="preserve">B5</w:t>
+              <w:t xml:space="preserve">C5</w:t>
             </w:r>
           </w:p>
         </w:tc>
@@ -2336,7 +4367,7 @@
                 <w:sz w:val="20"/>
                 <w:szCs w:val="20"/>
               </w:rPr>
-              <w:t xml:space="preserve">B6</w:t>
+              <w:t xml:space="preserve">C6</w:t>
             </w:r>
           </w:p>
         </w:tc>
@@ -2434,7 +4465,7 @@
                 <w:sz w:val="20"/>
                 <w:szCs w:val="20"/>
               </w:rPr>
-              <w:t xml:space="preserve">B7</w:t>
+              <w:t xml:space="preserve">C7</w:t>
             </w:r>
           </w:p>
         </w:tc>
@@ -2532,7 +4563,7 @@
                 <w:sz w:val="20"/>
                 <w:szCs w:val="20"/>
               </w:rPr>
-              <w:t xml:space="preserve">B8</w:t>
+              <w:t xml:space="preserve">C8</w:t>
             </w:r>
           </w:p>
         </w:tc>
@@ -2618,7 +4649,7 @@
           <w:sz w:val="28"/>
           <w:szCs w:val="28"/>
         </w:rPr>
-        <w:t xml:space="preserve">C.  Hosting, Infrastructure and Data Residency</w:t>
+        <w:t xml:space="preserve">D.  Hosting, Infrastructure and Data Residency</w:t>
       </w:r>
     </w:p>
     <w:p>
@@ -2794,7 +4825,7 @@
                 <w:sz w:val="20"/>
                 <w:szCs w:val="20"/>
               </w:rPr>
-              <w:t xml:space="preserve">C1</w:t>
+              <w:t xml:space="preserve">D1</w:t>
             </w:r>
           </w:p>
         </w:tc>
@@ -2892,7 +4923,7 @@
                 <w:sz w:val="20"/>
                 <w:szCs w:val="20"/>
               </w:rPr>
-              <w:t xml:space="preserve">C2</w:t>
+              <w:t xml:space="preserve">D2</w:t>
             </w:r>
           </w:p>
         </w:tc>
@@ -2990,7 +5021,7 @@
                 <w:sz w:val="20"/>
                 <w:szCs w:val="20"/>
               </w:rPr>
-              <w:t xml:space="preserve">C3</w:t>
+              <w:t xml:space="preserve">D3</w:t>
             </w:r>
           </w:p>
         </w:tc>
@@ -3021,7 +5052,7 @@
                 <w:sz w:val="20"/>
                 <w:szCs w:val="20"/>
               </w:rPr>
-              <w:t xml:space="preserve">Does ZIDA or Government already hold subscriptions or agreements with any cloud provider that the platform could use?</w:t>
+              <w:t xml:space="preserve">Is hosting through the Government Internet Service Provider (GISP) required or preferred for government platforms? What hosting, connectivity and service levels can GISP provide?</w:t>
             </w:r>
           </w:p>
         </w:tc>
@@ -3088,7 +5119,7 @@
                 <w:sz w:val="20"/>
                 <w:szCs w:val="20"/>
               </w:rPr>
-              <w:t xml:space="preserve">C4</w:t>
+              <w:t xml:space="preserve">D4</w:t>
             </w:r>
           </w:p>
         </w:tc>
@@ -3119,7 +5150,7 @@
                 <w:sz w:val="20"/>
                 <w:szCs w:val="20"/>
               </w:rPr>
-              <w:t xml:space="preserve">If on-premises hosting is preferred: where is the facility, who operates it, and what is its power backup, cooling, physical security and internet redundancy?</w:t>
+              <w:t xml:space="preserve">Does ZIDA or Government already hold subscriptions or agreements with any cloud provider that the platform could use?</w:t>
             </w:r>
           </w:p>
         </w:tc>
@@ -3186,7 +5217,7 @@
                 <w:sz w:val="20"/>
                 <w:szCs w:val="20"/>
               </w:rPr>
-              <w:t xml:space="preserve">C5</w:t>
+              <w:t xml:space="preserve">D5</w:t>
             </w:r>
           </w:p>
         </w:tc>
@@ -3217,7 +5248,7 @@
                 <w:sz w:val="20"/>
                 <w:szCs w:val="20"/>
               </w:rPr>
-              <w:t xml:space="preserve">What availability does Government expect (for example, 99.5% or 99.9%), and are there preferred maintenance windows?</w:t>
+              <w:t xml:space="preserve">If on-premises hosting is preferred: where is the facility, who operates it, and what is its power backup, cooling, physical security and internet redundancy?</w:t>
             </w:r>
           </w:p>
         </w:tc>
@@ -3284,7 +5315,7 @@
                 <w:sz w:val="20"/>
                 <w:szCs w:val="20"/>
               </w:rPr>
-              <w:t xml:space="preserve">C6</w:t>
+              <w:t xml:space="preserve">D6</w:t>
             </w:r>
           </w:p>
         </w:tc>
@@ -3315,7 +5346,7 @@
                 <w:sz w:val="20"/>
                 <w:szCs w:val="20"/>
               </w:rPr>
-              <w:t xml:space="preserve">In a serious outage, how much data could Government accept losing, and how quickly must service be restored?</w:t>
+              <w:t xml:space="preserve">What availability does Government expect (for example, 99.5% or 99.9%), and are there preferred maintenance windows?</w:t>
             </w:r>
           </w:p>
         </w:tc>
@@ -3382,7 +5413,7 @@
                 <w:sz w:val="20"/>
                 <w:szCs w:val="20"/>
               </w:rPr>
-              <w:t xml:space="preserve">C7</w:t>
+              <w:t xml:space="preserve">D7</w:t>
             </w:r>
           </w:p>
         </w:tc>
@@ -3413,7 +5444,7 @@
                 <w:sz w:val="20"/>
                 <w:szCs w:val="20"/>
               </w:rPr>
-              <w:t xml:space="preserve">Will separate environments be required for testing, training and production?</w:t>
+              <w:t xml:space="preserve">In a serious outage, how much data could Government accept losing, and how quickly must service be restored?</w:t>
             </w:r>
           </w:p>
         </w:tc>
@@ -3480,7 +5511,7 @@
                 <w:sz w:val="20"/>
                 <w:szCs w:val="20"/>
               </w:rPr>
-              <w:t xml:space="preserve">C8</w:t>
+              <w:t xml:space="preserve">D8</w:t>
             </w:r>
           </w:p>
         </w:tc>
@@ -3511,7 +5542,7 @@
                 <w:sz w:val="20"/>
                 <w:szCs w:val="20"/>
               </w:rPr>
-              <w:t xml:space="preserve">Should the production platform operate under a .gov.zw address? Who administers ZIDA’s domain names and DNS today?</w:t>
+              <w:t xml:space="preserve">Will separate environments be required for testing, training and production?</w:t>
             </w:r>
           </w:p>
         </w:tc>
@@ -3578,7 +5609,7 @@
                 <w:sz w:val="20"/>
                 <w:szCs w:val="20"/>
               </w:rPr>
-              <w:t xml:space="preserve">C9</w:t>
+              <w:t xml:space="preserve">D9</w:t>
             </w:r>
           </w:p>
         </w:tc>
@@ -3609,6 +5640,104 @@
                 <w:sz w:val="20"/>
                 <w:szCs w:val="20"/>
               </w:rPr>
+              <w:t xml:space="preserve">Should the production platform operate under a .gov.zw address? Who administers ZIDA’s domain names and DNS today?</w:t>
+            </w:r>
+          </w:p>
+        </w:tc>
+        <w:tc>
+          <w:tcPr>
+            <w:tcW w:type="dxa" w:w="3500"/>
+            <w:tcBorders>
+              <w:top w:val="single" w:color="C9D3CD" w:sz="4"/>
+              <w:left w:val="single" w:color="C9D3CD" w:sz="4"/>
+              <w:bottom w:val="single" w:color="C9D3CD" w:sz="4"/>
+              <w:right w:val="single" w:color="C9D3CD" w:sz="4"/>
+            </w:tcBorders>
+            <w:shd w:fill="FAFBFA" w:color="auto" w:val="clear"/>
+            <w:tcMar>
+              <w:top w:type="dxa" w:w="80"/>
+              <w:left w:type="dxa" w:w="110"/>
+              <w:bottom w:type="dxa" w:w="80"/>
+              <w:right w:type="dxa" w:w="110"/>
+            </w:tcMar>
+          </w:tcPr>
+          <w:p>
+            <w:pPr>
+              <w:spacing w:after="0"/>
+            </w:pPr>
+            <w:r>
+              <w:rPr>
+                <w:rFonts w:ascii="Calibri" w:cs="Calibri" w:eastAsia="Calibri" w:hAnsi="Calibri"/>
+                <w:sz w:val="20"/>
+                <w:szCs w:val="20"/>
+              </w:rPr>
+              <w:t xml:space="preserve"/>
+            </w:r>
+          </w:p>
+        </w:tc>
+      </w:tr>
+      <w:tr>
+        <w:trPr>
+          <w:cantSplit/>
+        </w:trPr>
+        <w:tc>
+          <w:tcPr>
+            <w:tcW w:type="dxa" w:w="700"/>
+            <w:tcBorders>
+              <w:top w:val="single" w:color="C9D3CD" w:sz="4"/>
+              <w:left w:val="single" w:color="C9D3CD" w:sz="4"/>
+              <w:bottom w:val="single" w:color="C9D3CD" w:sz="4"/>
+              <w:right w:val="single" w:color="C9D3CD" w:sz="4"/>
+            </w:tcBorders>
+            <w:shd w:fill="FFFFFF" w:color="auto" w:val="clear"/>
+            <w:tcMar>
+              <w:top w:type="dxa" w:w="80"/>
+              <w:left w:type="dxa" w:w="110"/>
+              <w:bottom w:type="dxa" w:w="80"/>
+              <w:right w:type="dxa" w:w="110"/>
+            </w:tcMar>
+          </w:tcPr>
+          <w:p>
+            <w:pPr>
+              <w:spacing w:after="0"/>
+            </w:pPr>
+            <w:r>
+              <w:rPr>
+                <w:rFonts w:ascii="Calibri" w:cs="Calibri" w:eastAsia="Calibri" w:hAnsi="Calibri"/>
+                <w:sz w:val="20"/>
+                <w:szCs w:val="20"/>
+              </w:rPr>
+              <w:t xml:space="preserve">D10</w:t>
+            </w:r>
+          </w:p>
+        </w:tc>
+        <w:tc>
+          <w:tcPr>
+            <w:tcW w:type="dxa" w:w="5438"/>
+            <w:tcBorders>
+              <w:top w:val="single" w:color="C9D3CD" w:sz="4"/>
+              <w:left w:val="single" w:color="C9D3CD" w:sz="4"/>
+              <w:bottom w:val="single" w:color="C9D3CD" w:sz="4"/>
+              <w:right w:val="single" w:color="C9D3CD" w:sz="4"/>
+            </w:tcBorders>
+            <w:shd w:fill="FFFFFF" w:color="auto" w:val="clear"/>
+            <w:tcMar>
+              <w:top w:type="dxa" w:w="80"/>
+              <w:left w:type="dxa" w:w="110"/>
+              <w:bottom w:type="dxa" w:w="80"/>
+              <w:right w:type="dxa" w:w="110"/>
+            </w:tcMar>
+          </w:tcPr>
+          <w:p>
+            <w:pPr>
+              <w:spacing w:after="0"/>
+            </w:pPr>
+            <w:r>
+              <w:rPr>
+                <w:rFonts w:ascii="Calibri" w:cs="Calibri" w:eastAsia="Calibri" w:hAnsi="Calibri"/>
+                <w:sz w:val="20"/>
+                <w:szCs w:val="20"/>
+              </w:rPr>
               <w:t xml:space="preserve">What internet connectivity is typical at ZIDA and ministry offices, and do officials mainly work on desktop computers, laptops or mobile devices?</w:t>
             </w:r>
           </w:p>
@@ -3622,7 +5751,7 @@
               <w:bottom w:val="single" w:color="C9D3CD" w:sz="4"/>
               <w:right w:val="single" w:color="C9D3CD" w:sz="4"/>
             </w:tcBorders>
-            <w:shd w:fill="FAFBFA" w:color="auto" w:val="clear"/>
+            <w:shd w:fill="FFFFFF" w:color="auto" w:val="clear"/>
             <w:tcMar>
               <w:top w:type="dxa" w:w="80"/>
               <w:left w:type="dxa" w:w="110"/>
@@ -3664,7 +5793,7 @@
           <w:sz w:val="28"/>
           <w:szCs w:val="28"/>
         </w:rPr>
-        <w:t xml:space="preserve">D.  Email Infrastructure and Official Domains</w:t>
+        <w:t xml:space="preserve">E.  Email Infrastructure and Official Domains</w:t>
       </w:r>
     </w:p>
     <w:p>
@@ -3840,7 +5969,7 @@
                 <w:sz w:val="20"/>
                 <w:szCs w:val="20"/>
               </w:rPr>
-              <w:t xml:space="preserve">D1</w:t>
+              <w:t xml:space="preserve">E1</w:t>
             </w:r>
           </w:p>
         </w:tc>
@@ -3938,7 +6067,7 @@
                 <w:sz w:val="20"/>
                 <w:szCs w:val="20"/>
               </w:rPr>
-              <w:t xml:space="preserve">D2</w:t>
+              <w:t xml:space="preserve">E2</w:t>
             </w:r>
           </w:p>
         </w:tc>
@@ -4036,7 +6165,7 @@
                 <w:sz w:val="20"/>
                 <w:szCs w:val="20"/>
               </w:rPr>
-              <w:t xml:space="preserve">D3</w:t>
+              <w:t xml:space="preserve">E3</w:t>
             </w:r>
           </w:p>
         </w:tc>
@@ -4134,7 +6263,7 @@
                 <w:sz w:val="20"/>
                 <w:szCs w:val="20"/>
               </w:rPr>
-              <w:t xml:space="preserve">D4</w:t>
+              <w:t xml:space="preserve">E4</w:t>
             </w:r>
           </w:p>
         </w:tc>
@@ -4165,7 +6294,7 @@
                 <w:sz w:val="20"/>
                 <w:szCs w:val="20"/>
               </w:rPr>
-              <w:t xml:space="preserve">Where a ministry has no registered .gov.zw domain, who can instruct it to obtain one through ZISPA, and what turnaround should we expect?</w:t>
+              <w:t xml:space="preserve">Where a ministry has no registered .gov.zw domain, who can instruct it to obtain one through GISP, the designated government domain registration and hosting provider, and what turnaround should we expect?</w:t>
             </w:r>
           </w:p>
         </w:tc>
@@ -4232,7 +6361,7 @@
                 <w:sz w:val="20"/>
                 <w:szCs w:val="20"/>
               </w:rPr>
-              <w:t xml:space="preserve">D5</w:t>
+              <w:t xml:space="preserve">E5</w:t>
             </w:r>
           </w:p>
         </w:tc>
@@ -4263,7 +6392,7 @@
                 <w:sz w:val="20"/>
                 <w:szCs w:val="20"/>
               </w:rPr>
-              <w:t xml:space="preserve">Is a government-wide email or collaboration initiative already planned or under way? Where a ministry does not yet have official email in place, Afronovation can support ZIDA and the relevant authorities in establishing it, for example on Microsoft 365.</w:t>
+              <w:t xml:space="preserve">Does GISP provide official email services to ministries? If so, on which platform, and must any new government email service be delivered through or approved by GISP?</w:t>
             </w:r>
           </w:p>
         </w:tc>
@@ -4330,7 +6459,7 @@
                 <w:sz w:val="20"/>
                 <w:szCs w:val="20"/>
               </w:rPr>
-              <w:t xml:space="preserve">D6</w:t>
+              <w:t xml:space="preserve">E6</w:t>
             </w:r>
           </w:p>
         </w:tc>
@@ -4361,7 +6490,7 @@
                 <w:sz w:val="20"/>
                 <w:szCs w:val="20"/>
               </w:rPr>
-              <w:t xml:space="preserve">Should platform notifications (approvals, alerts, investor correspondence) be sent from a .gov.zw address? Who can authorise the DNS records needed to send securely from that domain?</w:t>
+              <w:t xml:space="preserve">Is a government-wide email or collaboration initiative already planned or under way? Where a ministry does not yet have official email in place, Afronovation can support ZIDA, GISP and the relevant authorities in establishing it, for example on Microsoft 365.</w:t>
             </w:r>
           </w:p>
         </w:tc>
@@ -4428,7 +6557,7 @@
                 <w:sz w:val="20"/>
                 <w:szCs w:val="20"/>
               </w:rPr>
-              <w:t xml:space="preserve">D7</w:t>
+              <w:t xml:space="preserve">E7</w:t>
             </w:r>
           </w:p>
         </w:tc>
@@ -4459,6 +6588,104 @@
                 <w:sz w:val="20"/>
                 <w:szCs w:val="20"/>
               </w:rPr>
+              <w:t xml:space="preserve">Should platform notifications (approvals, alerts, investor correspondence) be sent from a .gov.zw address? Who can authorise the DNS records needed to send securely from that domain?</w:t>
+            </w:r>
+          </w:p>
+        </w:tc>
+        <w:tc>
+          <w:tcPr>
+            <w:tcW w:type="dxa" w:w="3500"/>
+            <w:tcBorders>
+              <w:top w:val="single" w:color="C9D3CD" w:sz="4"/>
+              <w:left w:val="single" w:color="C9D3CD" w:sz="4"/>
+              <w:bottom w:val="single" w:color="C9D3CD" w:sz="4"/>
+              <w:right w:val="single" w:color="C9D3CD" w:sz="4"/>
+            </w:tcBorders>
+            <w:shd w:fill="FAFBFA" w:color="auto" w:val="clear"/>
+            <w:tcMar>
+              <w:top w:type="dxa" w:w="80"/>
+              <w:left w:type="dxa" w:w="110"/>
+              <w:bottom w:type="dxa" w:w="80"/>
+              <w:right w:type="dxa" w:w="110"/>
+            </w:tcMar>
+          </w:tcPr>
+          <w:p>
+            <w:pPr>
+              <w:spacing w:after="0"/>
+            </w:pPr>
+            <w:r>
+              <w:rPr>
+                <w:rFonts w:ascii="Calibri" w:cs="Calibri" w:eastAsia="Calibri" w:hAnsi="Calibri"/>
+                <w:sz w:val="20"/>
+                <w:szCs w:val="20"/>
+              </w:rPr>
+              <w:t xml:space="preserve"/>
+            </w:r>
+          </w:p>
+        </w:tc>
+      </w:tr>
+      <w:tr>
+        <w:trPr>
+          <w:cantSplit/>
+        </w:trPr>
+        <w:tc>
+          <w:tcPr>
+            <w:tcW w:type="dxa" w:w="700"/>
+            <w:tcBorders>
+              <w:top w:val="single" w:color="C9D3CD" w:sz="4"/>
+              <w:left w:val="single" w:color="C9D3CD" w:sz="4"/>
+              <w:bottom w:val="single" w:color="C9D3CD" w:sz="4"/>
+              <w:right w:val="single" w:color="C9D3CD" w:sz="4"/>
+            </w:tcBorders>
+            <w:shd w:fill="FFFFFF" w:color="auto" w:val="clear"/>
+            <w:tcMar>
+              <w:top w:type="dxa" w:w="80"/>
+              <w:left w:type="dxa" w:w="110"/>
+              <w:bottom w:type="dxa" w:w="80"/>
+              <w:right w:type="dxa" w:w="110"/>
+            </w:tcMar>
+          </w:tcPr>
+          <w:p>
+            <w:pPr>
+              <w:spacing w:after="0"/>
+            </w:pPr>
+            <w:r>
+              <w:rPr>
+                <w:rFonts w:ascii="Calibri" w:cs="Calibri" w:eastAsia="Calibri" w:hAnsi="Calibri"/>
+                <w:sz w:val="20"/>
+                <w:szCs w:val="20"/>
+              </w:rPr>
+              <w:t xml:space="preserve">E8</w:t>
+            </w:r>
+          </w:p>
+        </w:tc>
+        <w:tc>
+          <w:tcPr>
+            <w:tcW w:type="dxa" w:w="5438"/>
+            <w:tcBorders>
+              <w:top w:val="single" w:color="C9D3CD" w:sz="4"/>
+              <w:left w:val="single" w:color="C9D3CD" w:sz="4"/>
+              <w:bottom w:val="single" w:color="C9D3CD" w:sz="4"/>
+              <w:right w:val="single" w:color="C9D3CD" w:sz="4"/>
+            </w:tcBorders>
+            <w:shd w:fill="FFFFFF" w:color="auto" w:val="clear"/>
+            <w:tcMar>
+              <w:top w:type="dxa" w:w="80"/>
+              <w:left w:type="dxa" w:w="110"/>
+              <w:bottom w:type="dxa" w:w="80"/>
+              <w:right w:type="dxa" w:w="110"/>
+            </w:tcMar>
+          </w:tcPr>
+          <w:p>
+            <w:pPr>
+              <w:spacing w:after="0"/>
+            </w:pPr>
+            <w:r>
+              <w:rPr>
+                <w:rFonts w:ascii="Calibri" w:cs="Calibri" w:eastAsia="Calibri" w:hAnsi="Calibri"/>
+                <w:sz w:val="20"/>
+                <w:szCs w:val="20"/>
+              </w:rPr>
               <w:t xml:space="preserve">Does Government accept the policy that government accounts on the platform are issued only to verified official email addresses?</w:t>
             </w:r>
           </w:p>
@@ -4472,7 +6699,7 @@
               <w:bottom w:val="single" w:color="C9D3CD" w:sz="4"/>
               <w:right w:val="single" w:color="C9D3CD" w:sz="4"/>
             </w:tcBorders>
-            <w:shd w:fill="FAFBFA" w:color="auto" w:val="clear"/>
+            <w:shd w:fill="FFFFFF" w:color="auto" w:val="clear"/>
             <w:tcMar>
               <w:top w:type="dxa" w:w="80"/>
               <w:left w:type="dxa" w:w="110"/>
@@ -4514,7 +6741,7 @@
           <w:sz w:val="28"/>
           <w:szCs w:val="28"/>
         </w:rPr>
-        <w:t xml:space="preserve">E.  Identity, Access and User Volumes</w:t>
+        <w:t xml:space="preserve">F.  Identity, Access and User Volumes</w:t>
       </w:r>
     </w:p>
     <w:p>
@@ -4690,7 +6917,7 @@
                 <w:sz w:val="20"/>
                 <w:szCs w:val="20"/>
               </w:rPr>
-              <w:t xml:space="preserve">E1</w:t>
+              <w:t xml:space="preserve">F1</w:t>
             </w:r>
           </w:p>
         </w:tc>
@@ -4788,7 +7015,7 @@
                 <w:sz w:val="20"/>
                 <w:szCs w:val="20"/>
               </w:rPr>
-              <w:t xml:space="preserve">E2</w:t>
+              <w:t xml:space="preserve">F2</w:t>
             </w:r>
           </w:p>
         </w:tc>
@@ -4886,7 +7113,7 @@
                 <w:sz w:val="20"/>
                 <w:szCs w:val="20"/>
               </w:rPr>
-              <w:t xml:space="preserve">E3</w:t>
+              <w:t xml:space="preserve">F3</w:t>
             </w:r>
           </w:p>
         </w:tc>
@@ -4984,7 +7211,7 @@
                 <w:sz w:val="20"/>
                 <w:szCs w:val="20"/>
               </w:rPr>
-              <w:t xml:space="preserve">E4</w:t>
+              <w:t xml:space="preserve">F4</w:t>
             </w:r>
           </w:p>
         </w:tc>
@@ -5082,7 +7309,7 @@
                 <w:sz w:val="20"/>
                 <w:szCs w:val="20"/>
               </w:rPr>
-              <w:t xml:space="preserve">E5</w:t>
+              <w:t xml:space="preserve">F5</w:t>
             </w:r>
           </w:p>
         </w:tc>
@@ -5180,7 +7407,7 @@
                 <w:sz w:val="20"/>
                 <w:szCs w:val="20"/>
               </w:rPr>
-              <w:t xml:space="preserve">E6</w:t>
+              <w:t xml:space="preserve">F6</w:t>
             </w:r>
           </w:p>
         </w:tc>
@@ -5266,7 +7493,7 @@
           <w:sz w:val="28"/>
           <w:szCs w:val="28"/>
         </w:rPr>
-        <w:t xml:space="preserve">F.  Security, Privacy and Regulatory Compliance</w:t>
+        <w:t xml:space="preserve">G.  Security, Privacy and Regulatory Compliance</w:t>
       </w:r>
     </w:p>
     <w:p>
@@ -5442,7 +7669,7 @@
                 <w:sz w:val="20"/>
                 <w:szCs w:val="20"/>
               </w:rPr>
-              <w:t xml:space="preserve">F1</w:t>
+              <w:t xml:space="preserve">G1</w:t>
             </w:r>
           </w:p>
         </w:tc>
@@ -5540,7 +7767,7 @@
                 <w:sz w:val="20"/>
                 <w:szCs w:val="20"/>
               </w:rPr>
-              <w:t xml:space="preserve">F2</w:t>
+              <w:t xml:space="preserve">G2</w:t>
             </w:r>
           </w:p>
         </w:tc>
@@ -5638,7 +7865,7 @@
                 <w:sz w:val="20"/>
                 <w:szCs w:val="20"/>
               </w:rPr>
-              <w:t xml:space="preserve">F3</w:t>
+              <w:t xml:space="preserve">G3</w:t>
             </w:r>
           </w:p>
         </w:tc>
@@ -5736,7 +7963,7 @@
                 <w:sz w:val="20"/>
                 <w:szCs w:val="20"/>
               </w:rPr>
-              <w:t xml:space="preserve">F4</w:t>
+              <w:t xml:space="preserve">G4</w:t>
             </w:r>
           </w:p>
         </w:tc>
@@ -5834,7 +8061,7 @@
                 <w:sz w:val="20"/>
                 <w:szCs w:val="20"/>
               </w:rPr>
-              <w:t xml:space="preserve">F5</w:t>
+              <w:t xml:space="preserve">G5</w:t>
             </w:r>
           </w:p>
         </w:tc>
@@ -5932,7 +8159,7 @@
                 <w:sz w:val="20"/>
                 <w:szCs w:val="20"/>
               </w:rPr>
-              <w:t xml:space="preserve">F6</w:t>
+              <w:t xml:space="preserve">G6</w:t>
             </w:r>
           </w:p>
         </w:tc>
@@ -5963,7 +8190,7 @@
                 <w:sz w:val="20"/>
                 <w:szCs w:val="20"/>
               </w:rPr>
-              <w:t xml:space="preserve">Is there a national cyber incident response team or security operations function we should integrate with? Who must be notified of a security incident, and within what time?</w:t>
+              <w:t xml:space="preserve">Does GISP or another government body provide centralised security monitoring the platform should connect to? ZidaProject includes built-in security monitoring, audit trail and compliance controls, which can operate on their own or feed into government monitoring.</w:t>
             </w:r>
           </w:p>
         </w:tc>
@@ -6030,7 +8257,7 @@
                 <w:sz w:val="20"/>
                 <w:szCs w:val="20"/>
               </w:rPr>
-              <w:t xml:space="preserve">F7</w:t>
+              <w:t xml:space="preserve">G7</w:t>
             </w:r>
           </w:p>
         </w:tc>
@@ -6061,7 +8288,7 @@
                 <w:sz w:val="20"/>
                 <w:szCs w:val="20"/>
               </w:rPr>
-              <w:t xml:space="preserve">What vetting, clearance or confidentiality undertakings are required for vendor personnel with access to the platform or its data?</w:t>
+              <w:t xml:space="preserve">Is there a national cyber incident response team or security operations function we should integrate with? Who must be notified of a security incident, and within what time?</w:t>
             </w:r>
           </w:p>
         </w:tc>
@@ -6128,7 +8355,7 @@
                 <w:sz w:val="20"/>
                 <w:szCs w:val="20"/>
               </w:rPr>
-              <w:t xml:space="preserve">F8</w:t>
+              <w:t xml:space="preserve">G8</w:t>
             </w:r>
           </w:p>
         </w:tc>
@@ -6159,6 +8386,104 @@
                 <w:sz w:val="20"/>
                 <w:szCs w:val="20"/>
               </w:rPr>
+              <w:t xml:space="preserve">What vetting, clearance or confidentiality undertakings are required for vendor personnel with access to the platform or its data?</w:t>
+            </w:r>
+          </w:p>
+        </w:tc>
+        <w:tc>
+          <w:tcPr>
+            <w:tcW w:type="dxa" w:w="3500"/>
+            <w:tcBorders>
+              <w:top w:val="single" w:color="C9D3CD" w:sz="4"/>
+              <w:left w:val="single" w:color="C9D3CD" w:sz="4"/>
+              <w:bottom w:val="single" w:color="C9D3CD" w:sz="4"/>
+              <w:right w:val="single" w:color="C9D3CD" w:sz="4"/>
+            </w:tcBorders>
+            <w:shd w:fill="FFFFFF" w:color="auto" w:val="clear"/>
+            <w:tcMar>
+              <w:top w:type="dxa" w:w="80"/>
+              <w:left w:type="dxa" w:w="110"/>
+              <w:bottom w:type="dxa" w:w="80"/>
+              <w:right w:type="dxa" w:w="110"/>
+            </w:tcMar>
+          </w:tcPr>
+          <w:p>
+            <w:pPr>
+              <w:spacing w:after="0"/>
+            </w:pPr>
+            <w:r>
+              <w:rPr>
+                <w:rFonts w:ascii="Calibri" w:cs="Calibri" w:eastAsia="Calibri" w:hAnsi="Calibri"/>
+                <w:sz w:val="20"/>
+                <w:szCs w:val="20"/>
+              </w:rPr>
+              <w:t xml:space="preserve"/>
+            </w:r>
+          </w:p>
+        </w:tc>
+      </w:tr>
+      <w:tr>
+        <w:trPr>
+          <w:cantSplit/>
+        </w:trPr>
+        <w:tc>
+          <w:tcPr>
+            <w:tcW w:type="dxa" w:w="700"/>
+            <w:tcBorders>
+              <w:top w:val="single" w:color="C9D3CD" w:sz="4"/>
+              <w:left w:val="single" w:color="C9D3CD" w:sz="4"/>
+              <w:bottom w:val="single" w:color="C9D3CD" w:sz="4"/>
+              <w:right w:val="single" w:color="C9D3CD" w:sz="4"/>
+            </w:tcBorders>
+            <w:shd w:fill="FAFBFA" w:color="auto" w:val="clear"/>
+            <w:tcMar>
+              <w:top w:type="dxa" w:w="80"/>
+              <w:left w:type="dxa" w:w="110"/>
+              <w:bottom w:type="dxa" w:w="80"/>
+              <w:right w:type="dxa" w:w="110"/>
+            </w:tcMar>
+          </w:tcPr>
+          <w:p>
+            <w:pPr>
+              <w:spacing w:after="0"/>
+            </w:pPr>
+            <w:r>
+              <w:rPr>
+                <w:rFonts w:ascii="Calibri" w:cs="Calibri" w:eastAsia="Calibri" w:hAnsi="Calibri"/>
+                <w:sz w:val="20"/>
+                <w:szCs w:val="20"/>
+              </w:rPr>
+              <w:t xml:space="preserve">G9</w:t>
+            </w:r>
+          </w:p>
+        </w:tc>
+        <w:tc>
+          <w:tcPr>
+            <w:tcW w:type="dxa" w:w="5438"/>
+            <w:tcBorders>
+              <w:top w:val="single" w:color="C9D3CD" w:sz="4"/>
+              <w:left w:val="single" w:color="C9D3CD" w:sz="4"/>
+              <w:bottom w:val="single" w:color="C9D3CD" w:sz="4"/>
+              <w:right w:val="single" w:color="C9D3CD" w:sz="4"/>
+            </w:tcBorders>
+            <w:shd w:fill="FAFBFA" w:color="auto" w:val="clear"/>
+            <w:tcMar>
+              <w:top w:type="dxa" w:w="80"/>
+              <w:left w:type="dxa" w:w="110"/>
+              <w:bottom w:type="dxa" w:w="80"/>
+              <w:right w:type="dxa" w:w="110"/>
+            </w:tcMar>
+          </w:tcPr>
+          <w:p>
+            <w:pPr>
+              <w:spacing w:after="0"/>
+            </w:pPr>
+            <w:r>
+              <w:rPr>
+                <w:rFonts w:ascii="Calibri" w:cs="Calibri" w:eastAsia="Calibri" w:hAnsi="Calibri"/>
+                <w:sz w:val="20"/>
+                <w:szCs w:val="20"/>
+              </w:rPr>
               <w:t xml:space="preserve">Please confirm the data ownership position set out in the Platform Document: Zimbabwe owns its data and content; Afronovation retains the platform intellectual property.</w:t>
             </w:r>
           </w:p>
@@ -6172,7 +8497,7 @@
               <w:bottom w:val="single" w:color="C9D3CD" w:sz="4"/>
               <w:right w:val="single" w:color="C9D3CD" w:sz="4"/>
             </w:tcBorders>
-            <w:shd w:fill="FFFFFF" w:color="auto" w:val="clear"/>
+            <w:shd w:fill="FAFBFA" w:color="auto" w:val="clear"/>
             <w:tcMar>
               <w:top w:type="dxa" w:w="80"/>
               <w:left w:type="dxa" w:w="110"/>
@@ -6214,7 +8539,7 @@
           <w:sz w:val="28"/>
           <w:szCs w:val="28"/>
         </w:rPr>
-        <w:t xml:space="preserve">G.  Data, Content and Integrations</w:t>
+        <w:t xml:space="preserve">H.  Data, Content and Integrations</w:t>
       </w:r>
     </w:p>
     <w:p>
@@ -6390,7 +8715,7 @@
                 <w:sz w:val="20"/>
                 <w:szCs w:val="20"/>
               </w:rPr>
-              <w:t xml:space="preserve">G1</w:t>
+              <w:t xml:space="preserve">H1</w:t>
             </w:r>
           </w:p>
         </w:tc>
@@ -6488,7 +8813,7 @@
                 <w:sz w:val="20"/>
                 <w:szCs w:val="20"/>
               </w:rPr>
-              <w:t xml:space="preserve">G2</w:t>
+              <w:t xml:space="preserve">H2</w:t>
             </w:r>
           </w:p>
         </w:tc>
@@ -6586,7 +8911,7 @@
                 <w:sz w:val="20"/>
                 <w:szCs w:val="20"/>
               </w:rPr>
-              <w:t xml:space="preserve">G3</w:t>
+              <w:t xml:space="preserve">H3</w:t>
             </w:r>
           </w:p>
         </w:tc>
@@ -6684,7 +9009,7 @@
                 <w:sz w:val="20"/>
                 <w:szCs w:val="20"/>
               </w:rPr>
-              <w:t xml:space="preserve">G4</w:t>
+              <w:t xml:space="preserve">H4</w:t>
             </w:r>
           </w:p>
         </w:tc>
@@ -6782,7 +9107,7 @@
                 <w:sz w:val="20"/>
                 <w:szCs w:val="20"/>
               </w:rPr>
-              <w:t xml:space="preserve">G5</w:t>
+              <w:t xml:space="preserve">H5</w:t>
             </w:r>
           </w:p>
         </w:tc>
@@ -6880,7 +9205,7 @@
                 <w:sz w:val="20"/>
                 <w:szCs w:val="20"/>
               </w:rPr>
-              <w:t xml:space="preserve">G6</w:t>
+              <w:t xml:space="preserve">H6</w:t>
             </w:r>
           </w:p>
         </w:tc>
@@ -6966,7 +9291,7 @@
           <w:sz w:val="28"/>
           <w:szCs w:val="28"/>
         </w:rPr>
-        <w:t xml:space="preserve">H.  Team Capability, Support and Operating Model</w:t>
+        <w:t xml:space="preserve">I.  Team Capability, Support and Operating Model</w:t>
       </w:r>
     </w:p>
     <w:p>
@@ -7142,7 +9467,7 @@
                 <w:sz w:val="20"/>
                 <w:szCs w:val="20"/>
               </w:rPr>
-              <w:t xml:space="preserve">H1</w:t>
+              <w:t xml:space="preserve">I1</w:t>
             </w:r>
           </w:p>
         </w:tc>
@@ -7240,7 +9565,7 @@
                 <w:sz w:val="20"/>
                 <w:szCs w:val="20"/>
               </w:rPr>
-              <w:t xml:space="preserve">H2</w:t>
+              <w:t xml:space="preserve">I2</w:t>
             </w:r>
           </w:p>
         </w:tc>
@@ -7338,7 +9663,7 @@
                 <w:sz w:val="20"/>
                 <w:szCs w:val="20"/>
               </w:rPr>
-              <w:t xml:space="preserve">H3</w:t>
+              <w:t xml:space="preserve">I3</w:t>
             </w:r>
           </w:p>
         </w:tc>
@@ -7436,7 +9761,7 @@
                 <w:sz w:val="20"/>
                 <w:szCs w:val="20"/>
               </w:rPr>
-              <w:t xml:space="preserve">H4</w:t>
+              <w:t xml:space="preserve">I4</w:t>
             </w:r>
           </w:p>
         </w:tc>
@@ -7534,7 +9859,7 @@
                 <w:sz w:val="20"/>
                 <w:szCs w:val="20"/>
               </w:rPr>
-              <w:t xml:space="preserve">H5</w:t>
+              <w:t xml:space="preserve">I5</w:t>
             </w:r>
           </w:p>
         </w:tc>
@@ -7632,7 +9957,7 @@
                 <w:sz w:val="20"/>
                 <w:szCs w:val="20"/>
               </w:rPr>
-              <w:t xml:space="preserve">H6</w:t>
+              <w:t xml:space="preserve">I6</w:t>
             </w:r>
           </w:p>
         </w:tc>
@@ -7730,7 +10055,7 @@
                 <w:sz w:val="20"/>
                 <w:szCs w:val="20"/>
               </w:rPr>
-              <w:t xml:space="preserve">H7</w:t>
+              <w:t xml:space="preserve">I7</w:t>
             </w:r>
           </w:p>
         </w:tc>
@@ -7816,7 +10141,7 @@
           <w:sz w:val="28"/>
           <w:szCs w:val="28"/>
         </w:rPr>
-        <w:t xml:space="preserve">I.  Success Measures and Assurance</w:t>
+        <w:t xml:space="preserve">J.  Success Measures and Assurance</w:t>
       </w:r>
     </w:p>
     <w:p>
@@ -7992,7 +10317,7 @@
                 <w:sz w:val="20"/>
                 <w:szCs w:val="20"/>
               </w:rPr>
-              <w:t xml:space="preserve">I1</w:t>
+              <w:t xml:space="preserve">J1</w:t>
             </w:r>
           </w:p>
         </w:tc>
@@ -8090,7 +10415,7 @@
                 <w:sz w:val="20"/>
                 <w:szCs w:val="20"/>
               </w:rPr>
-              <w:t xml:space="preserve">I2</w:t>
+              <w:t xml:space="preserve">J2</w:t>
             </w:r>
           </w:p>
         </w:tc>
@@ -8188,7 +10513,7 @@
                 <w:sz w:val="20"/>
                 <w:szCs w:val="20"/>
               </w:rPr>
-              <w:t xml:space="preserve">I3</w:t>
+              <w:t xml:space="preserve">J3</w:t>
             </w:r>
           </w:p>
         </w:tc>
@@ -8549,7 +10874,7 @@
                 <w:sz w:val="19"/>
                 <w:szCs w:val="19"/>
               </w:rPr>
-              <w:t xml:space="preserve">Registered with ZISPA (Y/N)</w:t>
+              <w:t xml:space="preserve">Registered with GISP (Y/N)</w:t>
             </w:r>
           </w:p>
         </w:tc>

</xml_diff>

<commit_message>
Questionnaire: add NDAP alignment line to every section; save reusable builder
Each question area now states in one line how it serves Vision 2030,
NDS2, Smart Zimbabwe 2030, government digitalisation or ZIDA's mandate.
The generator script is kept as a template for future platforms.

Co-Authored-By: Claude Opus 5.5 <noreply@anthropic.com>
Claude-Session: https://claude.ai/code/session_01X474181YGTsF16kamYY3c3
</commit_message>
<xml_diff>
--- a/docs/ZIDA-Pre-Implementation-Discovery-Questionnaire.docx
+++ b/docs/ZIDA-Pre-Implementation-Discovery-Questionnaire.docx
@@ -2021,6 +2021,47 @@
         <w:t xml:space="preserve">These answers ensure the platform is implemented as part of Government’s digital transformation agenda, reported against national priorities, and positioned as the first visible layer of a wider programme rather than a standalone system.</w:t>
       </w:r>
     </w:p>
+    <w:p>
+      <w:pPr>
+        <w:keepNext/>
+        <w:pBdr>
+          <w:left w:val="single" w:color="B8860B" w:sz="18" w:space="8"/>
+        </w:pBdr>
+        <w:shd w:fill="EEF3EF" w:color="auto" w:val="clear"/>
+        <w:spacing w:after="160" w:before="60"/>
+        <w:ind w:left="120"/>
+      </w:pPr>
+      <w:r>
+        <w:rPr>
+          <w:rFonts w:ascii="Calibri" w:cs="Calibri" w:eastAsia="Calibri" w:hAnsi="Calibri"/>
+          <w:b/>
+          <w:bCs/>
+          <w:color w:val="14532D"/>
+          <w:sz w:val="20"/>
+          <w:szCs w:val="20"/>
+        </w:rPr>
+        <w:t xml:space="preserve">NDAP alignment — </w:t>
+      </w:r>
+      <w:r>
+        <w:rPr>
+          <w:rFonts w:ascii="Calibri" w:cs="Calibri" w:eastAsia="Calibri" w:hAnsi="Calibri"/>
+          <w:b/>
+          <w:bCs/>
+          <w:color w:val="B8860B"/>
+          <w:sz w:val="20"/>
+          <w:szCs w:val="20"/>
+        </w:rPr>
+        <w:t xml:space="preserve">Vision 2030 / Smart Zimbabwe 2030: </w:t>
+      </w:r>
+      <w:r>
+        <w:rPr>
+          <w:rFonts w:ascii="Calibri" w:cs="Calibri" w:eastAsia="Calibri" w:hAnsi="Calibri"/>
+          <w:sz w:val="20"/>
+          <w:szCs w:val="20"/>
+        </w:rPr>
+        <w:t xml:space="preserve">anchors the platform in Government’s digital transformation agenda, so every NDAP workstream builds on shared direction, standards and oversight.</w:t>
+      </w:r>
+    </w:p>
     <w:tbl>
       <w:tblPr>
         <w:tblW w:type="dxa" w:w="9638"/>
@@ -2773,6 +2814,47 @@
         <w:t xml:space="preserve">Clear ownership and decision rights determine the governance model, the approval path and the timeline we plan against.</w:t>
       </w:r>
     </w:p>
+    <w:p>
+      <w:pPr>
+        <w:keepNext/>
+        <w:pBdr>
+          <w:left w:val="single" w:color="B8860B" w:sz="18" w:space="8"/>
+        </w:pBdr>
+        <w:shd w:fill="EEF3EF" w:color="auto" w:val="clear"/>
+        <w:spacing w:after="160" w:before="60"/>
+        <w:ind w:left="120"/>
+      </w:pPr>
+      <w:r>
+        <w:rPr>
+          <w:rFonts w:ascii="Calibri" w:cs="Calibri" w:eastAsia="Calibri" w:hAnsi="Calibri"/>
+          <w:b/>
+          <w:bCs/>
+          <w:color w:val="14532D"/>
+          <w:sz w:val="20"/>
+          <w:szCs w:val="20"/>
+        </w:rPr>
+        <w:t xml:space="preserve">NDAP alignment — </w:t>
+      </w:r>
+      <w:r>
+        <w:rPr>
+          <w:rFonts w:ascii="Calibri" w:cs="Calibri" w:eastAsia="Calibri" w:hAnsi="Calibri"/>
+          <w:b/>
+          <w:bCs/>
+          <w:color w:val="B8860B"/>
+          <w:sz w:val="20"/>
+          <w:szCs w:val="20"/>
+        </w:rPr>
+        <w:t xml:space="preserve">NDS2 / ZIDA mandate: </w:t>
+      </w:r>
+      <w:r>
+        <w:rPr>
+          <w:rFonts w:ascii="Calibri" w:cs="Calibri" w:eastAsia="Calibri" w:hAnsi="Calibri"/>
+          <w:sz w:val="20"/>
+          <w:szCs w:val="20"/>
+        </w:rPr>
+        <w:t xml:space="preserve">clear institutional ownership keeps delivery coordinated across ministries and accountable to national priorities.</w:t>
+      </w:r>
+    </w:p>
     <w:tbl>
       <w:tblPr>
         <w:tblW w:type="dxa" w:w="9638"/>
@@ -3721,6 +3803,47 @@
         <w:t xml:space="preserve">These answers allow us to structure acquisition options that fit your procurement rules and budget cycle rather than requiring them to adapt.</w:t>
       </w:r>
     </w:p>
+    <w:p>
+      <w:pPr>
+        <w:keepNext/>
+        <w:pBdr>
+          <w:left w:val="single" w:color="B8860B" w:sz="18" w:space="8"/>
+        </w:pBdr>
+        <w:shd w:fill="EEF3EF" w:color="auto" w:val="clear"/>
+        <w:spacing w:after="160" w:before="60"/>
+        <w:ind w:left="120"/>
+      </w:pPr>
+      <w:r>
+        <w:rPr>
+          <w:rFonts w:ascii="Calibri" w:cs="Calibri" w:eastAsia="Calibri" w:hAnsi="Calibri"/>
+          <w:b/>
+          <w:bCs/>
+          <w:color w:val="14532D"/>
+          <w:sz w:val="20"/>
+          <w:szCs w:val="20"/>
+        </w:rPr>
+        <w:t xml:space="preserve">NDAP alignment — </w:t>
+      </w:r>
+      <w:r>
+        <w:rPr>
+          <w:rFonts w:ascii="Calibri" w:cs="Calibri" w:eastAsia="Calibri" w:hAnsi="Calibri"/>
+          <w:b/>
+          <w:bCs/>
+          <w:color w:val="B8860B"/>
+          <w:sz w:val="20"/>
+          <w:szCs w:val="20"/>
+        </w:rPr>
+        <w:t xml:space="preserve">NDS2: </w:t>
+      </w:r>
+      <w:r>
+        <w:rPr>
+          <w:rFonts w:ascii="Calibri" w:cs="Calibri" w:eastAsia="Calibri" w:hAnsi="Calibri"/>
+          <w:sz w:val="20"/>
+          <w:szCs w:val="20"/>
+        </w:rPr>
+        <w:t xml:space="preserve">a transparent, well-structured acquisition supports accountable, value-for-money delivery of national digital infrastructure.</w:t>
+      </w:r>
+    </w:p>
     <w:tbl>
       <w:tblPr>
         <w:tblW w:type="dxa" w:w="9638"/>
@@ -4669,6 +4792,47 @@
         <w:t xml:space="preserve">Hosting location is the single largest driver of cost, security posture and time to production. The pilot currently runs on commercial cloud services located largely outside Zimbabwe; the production location will follow Government’s answers below.</w:t>
       </w:r>
     </w:p>
+    <w:p>
+      <w:pPr>
+        <w:keepNext/>
+        <w:pBdr>
+          <w:left w:val="single" w:color="B8860B" w:sz="18" w:space="8"/>
+        </w:pBdr>
+        <w:shd w:fill="EEF3EF" w:color="auto" w:val="clear"/>
+        <w:spacing w:after="160" w:before="60"/>
+        <w:ind w:left="120"/>
+      </w:pPr>
+      <w:r>
+        <w:rPr>
+          <w:rFonts w:ascii="Calibri" w:cs="Calibri" w:eastAsia="Calibri" w:hAnsi="Calibri"/>
+          <w:b/>
+          <w:bCs/>
+          <w:color w:val="14532D"/>
+          <w:sz w:val="20"/>
+          <w:szCs w:val="20"/>
+        </w:rPr>
+        <w:t xml:space="preserve">NDAP alignment — </w:t>
+      </w:r>
+      <w:r>
+        <w:rPr>
+          <w:rFonts w:ascii="Calibri" w:cs="Calibri" w:eastAsia="Calibri" w:hAnsi="Calibri"/>
+          <w:b/>
+          <w:bCs/>
+          <w:color w:val="B8860B"/>
+          <w:sz w:val="20"/>
+          <w:szCs w:val="20"/>
+        </w:rPr>
+        <w:t xml:space="preserve">Smart Zimbabwe 2030 / Government digitalisation: </w:t>
+      </w:r>
+      <w:r>
+        <w:rPr>
+          <w:rFonts w:ascii="Calibri" w:cs="Calibri" w:eastAsia="Calibri" w:hAnsi="Calibri"/>
+          <w:sz w:val="20"/>
+          <w:szCs w:val="20"/>
+        </w:rPr>
+        <w:t xml:space="preserve">keeps national data under Government’s authority on designated infrastructure, the foundation that later NDAP services will share.</w:t>
+      </w:r>
+    </w:p>
     <w:tbl>
       <w:tblPr>
         <w:tblW w:type="dxa" w:w="9638"/>
@@ -5813,6 +5977,47 @@
         <w:t xml:space="preserve">For security, access to government roles on the platform will be restricted to verified official government email addresses. Generic addresses (Gmail, Yahoo and similar) will not be accepted for government users. Annex A records the position for each ministry.</w:t>
       </w:r>
     </w:p>
+    <w:p>
+      <w:pPr>
+        <w:keepNext/>
+        <w:pBdr>
+          <w:left w:val="single" w:color="B8860B" w:sz="18" w:space="8"/>
+        </w:pBdr>
+        <w:shd w:fill="EEF3EF" w:color="auto" w:val="clear"/>
+        <w:spacing w:after="160" w:before="60"/>
+        <w:ind w:left="120"/>
+      </w:pPr>
+      <w:r>
+        <w:rPr>
+          <w:rFonts w:ascii="Calibri" w:cs="Calibri" w:eastAsia="Calibri" w:hAnsi="Calibri"/>
+          <w:b/>
+          <w:bCs/>
+          <w:color w:val="14532D"/>
+          <w:sz w:val="20"/>
+          <w:szCs w:val="20"/>
+        </w:rPr>
+        <w:t xml:space="preserve">NDAP alignment — </w:t>
+      </w:r>
+      <w:r>
+        <w:rPr>
+          <w:rFonts w:ascii="Calibri" w:cs="Calibri" w:eastAsia="Calibri" w:hAnsi="Calibri"/>
+          <w:b/>
+          <w:bCs/>
+          <w:color w:val="B8860B"/>
+          <w:sz w:val="20"/>
+          <w:szCs w:val="20"/>
+        </w:rPr>
+        <w:t xml:space="preserve">Government digitalisation: </w:t>
+      </w:r>
+      <w:r>
+        <w:rPr>
+          <w:rFonts w:ascii="Calibri" w:cs="Calibri" w:eastAsia="Calibri" w:hAnsi="Calibri"/>
+          <w:sz w:val="20"/>
+          <w:szCs w:val="20"/>
+        </w:rPr>
+        <w:t xml:space="preserve">a trusted .gov.zw identity for every official is a prerequisite for secure digital government, and is reused by every future system.</w:t>
+      </w:r>
+    </w:p>
     <w:tbl>
       <w:tblPr>
         <w:tblW w:type="dxa" w:w="9638"/>
@@ -6761,6 +6966,47 @@
         <w:t xml:space="preserve">Access design and user numbers drive licensing, capacity planning and the onboarding effort for each ministry.</w:t>
       </w:r>
     </w:p>
+    <w:p>
+      <w:pPr>
+        <w:keepNext/>
+        <w:pBdr>
+          <w:left w:val="single" w:color="B8860B" w:sz="18" w:space="8"/>
+        </w:pBdr>
+        <w:shd w:fill="EEF3EF" w:color="auto" w:val="clear"/>
+        <w:spacing w:after="160" w:before="60"/>
+        <w:ind w:left="120"/>
+      </w:pPr>
+      <w:r>
+        <w:rPr>
+          <w:rFonts w:ascii="Calibri" w:cs="Calibri" w:eastAsia="Calibri" w:hAnsi="Calibri"/>
+          <w:b/>
+          <w:bCs/>
+          <w:color w:val="14532D"/>
+          <w:sz w:val="20"/>
+          <w:szCs w:val="20"/>
+        </w:rPr>
+        <w:t xml:space="preserve">NDAP alignment — </w:t>
+      </w:r>
+      <w:r>
+        <w:rPr>
+          <w:rFonts w:ascii="Calibri" w:cs="Calibri" w:eastAsia="Calibri" w:hAnsi="Calibri"/>
+          <w:b/>
+          <w:bCs/>
+          <w:color w:val="B8860B"/>
+          <w:sz w:val="20"/>
+          <w:szCs w:val="20"/>
+        </w:rPr>
+        <w:t xml:space="preserve">Smart Zimbabwe 2030 / ZIDA mandate: </w:t>
+      </w:r>
+      <w:r>
+        <w:rPr>
+          <w:rFonts w:ascii="Calibri" w:cs="Calibri" w:eastAsia="Calibri" w:hAnsi="Calibri"/>
+          <w:sz w:val="20"/>
+          <w:szCs w:val="20"/>
+        </w:rPr>
+        <w:t xml:space="preserve">secure, verified access for officials and investors builds trust in government digital services and strengthens investor facilitation.</w:t>
+      </w:r>
+    </w:p>
     <w:tbl>
       <w:tblPr>
         <w:tblW w:type="dxa" w:w="9638"/>
@@ -7513,6 +7759,47 @@
         <w:t xml:space="preserve">The platform will hold confidential project and investor information. These answers define the security controls, approvals and assurance activities we must include.</w:t>
       </w:r>
     </w:p>
+    <w:p>
+      <w:pPr>
+        <w:keepNext/>
+        <w:pBdr>
+          <w:left w:val="single" w:color="B8860B" w:sz="18" w:space="8"/>
+        </w:pBdr>
+        <w:shd w:fill="EEF3EF" w:color="auto" w:val="clear"/>
+        <w:spacing w:after="160" w:before="60"/>
+        <w:ind w:left="120"/>
+      </w:pPr>
+      <w:r>
+        <w:rPr>
+          <w:rFonts w:ascii="Calibri" w:cs="Calibri" w:eastAsia="Calibri" w:hAnsi="Calibri"/>
+          <w:b/>
+          <w:bCs/>
+          <w:color w:val="14532D"/>
+          <w:sz w:val="20"/>
+          <w:szCs w:val="20"/>
+        </w:rPr>
+        <w:t xml:space="preserve">NDAP alignment — </w:t>
+      </w:r>
+      <w:r>
+        <w:rPr>
+          <w:rFonts w:ascii="Calibri" w:cs="Calibri" w:eastAsia="Calibri" w:hAnsi="Calibri"/>
+          <w:b/>
+          <w:bCs/>
+          <w:color w:val="B8860B"/>
+          <w:sz w:val="20"/>
+          <w:szCs w:val="20"/>
+        </w:rPr>
+        <w:t xml:space="preserve">Government digitalisation: </w:t>
+      </w:r>
+      <w:r>
+        <w:rPr>
+          <w:rFonts w:ascii="Calibri" w:cs="Calibri" w:eastAsia="Calibri" w:hAnsi="Calibri"/>
+          <w:sz w:val="20"/>
+          <w:szCs w:val="20"/>
+        </w:rPr>
+        <w:t xml:space="preserve">protecting official and investor information under national law is what allows Government to digitise its systems with confidence.</w:t>
+      </w:r>
+    </w:p>
     <w:tbl>
       <w:tblPr>
         <w:tblW w:type="dxa" w:w="9638"/>
@@ -8559,6 +8846,47 @@
         <w:t xml:space="preserve">Content readiness and integrations are often underestimated. These answers size the migration, onboarding and integration work.</w:t>
       </w:r>
     </w:p>
+    <w:p>
+      <w:pPr>
+        <w:keepNext/>
+        <w:pBdr>
+          <w:left w:val="single" w:color="B8860B" w:sz="18" w:space="8"/>
+        </w:pBdr>
+        <w:shd w:fill="EEF3EF" w:color="auto" w:val="clear"/>
+        <w:spacing w:after="160" w:before="60"/>
+        <w:ind w:left="120"/>
+      </w:pPr>
+      <w:r>
+        <w:rPr>
+          <w:rFonts w:ascii="Calibri" w:cs="Calibri" w:eastAsia="Calibri" w:hAnsi="Calibri"/>
+          <w:b/>
+          <w:bCs/>
+          <w:color w:val="14532D"/>
+          <w:sz w:val="20"/>
+          <w:szCs w:val="20"/>
+        </w:rPr>
+        <w:t xml:space="preserve">NDAP alignment — </w:t>
+      </w:r>
+      <w:r>
+        <w:rPr>
+          <w:rFonts w:ascii="Calibri" w:cs="Calibri" w:eastAsia="Calibri" w:hAnsi="Calibri"/>
+          <w:b/>
+          <w:bCs/>
+          <w:color w:val="B8860B"/>
+          <w:sz w:val="20"/>
+          <w:szCs w:val="20"/>
+        </w:rPr>
+        <w:t xml:space="preserve">Smart Zimbabwe 2030 / NDAP Interoperability: </w:t>
+      </w:r>
+      <w:r>
+        <w:rPr>
+          <w:rFonts w:ascii="Calibri" w:cs="Calibri" w:eastAsia="Calibri" w:hAnsi="Calibri"/>
+          <w:sz w:val="20"/>
+          <w:szCs w:val="20"/>
+        </w:rPr>
+        <w:t xml:space="preserve">connected, well-governed data avoids new silos and prepares for secure data exchange across institutions.</w:t>
+      </w:r>
+    </w:p>
     <w:tbl>
       <w:tblPr>
         <w:tblW w:type="dxa" w:w="9638"/>
@@ -9311,6 +9639,47 @@
         <w:t xml:space="preserve">The right operating model depends on the capacity Government already has. These answers determine the support, training and knowledge-transfer components of each option.</w:t>
       </w:r>
     </w:p>
+    <w:p>
+      <w:pPr>
+        <w:keepNext/>
+        <w:pBdr>
+          <w:left w:val="single" w:color="B8860B" w:sz="18" w:space="8"/>
+        </w:pBdr>
+        <w:shd w:fill="EEF3EF" w:color="auto" w:val="clear"/>
+        <w:spacing w:after="160" w:before="60"/>
+        <w:ind w:left="120"/>
+      </w:pPr>
+      <w:r>
+        <w:rPr>
+          <w:rFonts w:ascii="Calibri" w:cs="Calibri" w:eastAsia="Calibri" w:hAnsi="Calibri"/>
+          <w:b/>
+          <w:bCs/>
+          <w:color w:val="14532D"/>
+          <w:sz w:val="20"/>
+          <w:szCs w:val="20"/>
+        </w:rPr>
+        <w:t xml:space="preserve">NDAP alignment — </w:t>
+      </w:r>
+      <w:r>
+        <w:rPr>
+          <w:rFonts w:ascii="Calibri" w:cs="Calibri" w:eastAsia="Calibri" w:hAnsi="Calibri"/>
+          <w:b/>
+          <w:bCs/>
+          <w:color w:val="B8860B"/>
+          <w:sz w:val="20"/>
+          <w:szCs w:val="20"/>
+        </w:rPr>
+        <w:t xml:space="preserve">Vision 2030 / NDAP Capacity Transfer: </w:t>
+      </w:r>
+      <w:r>
+        <w:rPr>
+          <w:rFonts w:ascii="Calibri" w:cs="Calibri" w:eastAsia="Calibri" w:hAnsi="Calibri"/>
+          <w:sz w:val="20"/>
+          <w:szCs w:val="20"/>
+        </w:rPr>
+        <w:t xml:space="preserve">builds local skills so Zimbabwe can sustain and grow its own digital systems.</w:t>
+      </w:r>
+    </w:p>
     <w:tbl>
       <w:tblPr>
         <w:tblW w:type="dxa" w:w="9638"/>
@@ -10159,6 +10528,47 @@
           <w:szCs w:val="21"/>
         </w:rPr>
         <w:t xml:space="preserve">Agreeing how success is measured at the outset allows each option to be priced against outcomes Government values.</w:t>
+      </w:r>
+    </w:p>
+    <w:p>
+      <w:pPr>
+        <w:keepNext/>
+        <w:pBdr>
+          <w:left w:val="single" w:color="B8860B" w:sz="18" w:space="8"/>
+        </w:pBdr>
+        <w:shd w:fill="EEF3EF" w:color="auto" w:val="clear"/>
+        <w:spacing w:after="160" w:before="60"/>
+        <w:ind w:left="120"/>
+      </w:pPr>
+      <w:r>
+        <w:rPr>
+          <w:rFonts w:ascii="Calibri" w:cs="Calibri" w:eastAsia="Calibri" w:hAnsi="Calibri"/>
+          <w:b/>
+          <w:bCs/>
+          <w:color w:val="14532D"/>
+          <w:sz w:val="20"/>
+          <w:szCs w:val="20"/>
+        </w:rPr>
+        <w:t xml:space="preserve">NDAP alignment — </w:t>
+      </w:r>
+      <w:r>
+        <w:rPr>
+          <w:rFonts w:ascii="Calibri" w:cs="Calibri" w:eastAsia="Calibri" w:hAnsi="Calibri"/>
+          <w:b/>
+          <w:bCs/>
+          <w:color w:val="B8860B"/>
+          <w:sz w:val="20"/>
+          <w:szCs w:val="20"/>
+        </w:rPr>
+        <w:t xml:space="preserve">NDS2 / ZIDA mandate: </w:t>
+      </w:r>
+      <w:r>
+        <w:rPr>
+          <w:rFonts w:ascii="Calibri" w:cs="Calibri" w:eastAsia="Calibri" w:hAnsi="Calibri"/>
+          <w:sz w:val="20"/>
+          <w:szCs w:val="20"/>
+        </w:rPr>
+        <w:t xml:space="preserve">ties platform results to measurable investment outcomes that advance Vision 2030.</w:t>
       </w:r>
     </w:p>
     <w:tbl>

</xml_diff>